<commit_message>
fix field minus logic
</commit_message>
<xml_diff>
--- a/templates/New_Template2.docx
+++ b/templates/New_Template2.docx
@@ -30,7 +30,25 @@
           <w:bCs/>
           <w:color w:val="4F83BE"/>
         </w:rPr>
-        <w:t>ANEXO II AL INFORME</w:t>
+        <w:t>ANEXO</w:t>
+      </w:r>
+      <w:r>
+        <w:rPr>
+          <w:rFonts w:ascii="Gordita Light" w:hAnsi="Gordita Light" w:cs="GorditaLight"/>
+          <w:b/>
+          <w:bCs/>
+          <w:color w:val="4F83BE"/>
+        </w:rPr>
+        <w:t xml:space="preserve"> </w:t>
+      </w:r>
+      <w:r>
+        <w:rPr>
+          <w:rFonts w:ascii="Gordita Light" w:hAnsi="Gordita Light" w:cs="GorditaLight"/>
+          <w:b/>
+          <w:bCs/>
+          <w:color w:val="4F83BE"/>
+        </w:rPr>
+        <w:t>AL INFORME</w:t>
       </w:r>
     </w:p>
     <w:p>
@@ -4642,6 +4660,7 @@
     <w:p>
       <w:pPr>
         <w:spacing w:after="0"/>
+        <w:jc w:val="both"/>
         <w:rPr>
           <w:rFonts w:ascii="Gordita Light" w:hAnsi="Gordita Light" w:cs="GorditaLight"/>
           <w:color w:val="4F83BE"/>
@@ -6390,25 +6409,24 @@
                 <w:lang w:val="es-ES"/>
               </w:rPr>
             </w:pPr>
-            <w:proofErr w:type="gramStart"/>
-            <w:r>
-              <w:rPr>
-                <w:rFonts w:ascii="Gordita Light" w:hAnsi="Gordita Light" w:cs="GorditaLight"/>
-                <w:sz w:val="18"/>
-                <w:szCs w:val="18"/>
-                <w:lang w:val="es-ES"/>
-              </w:rPr>
-              <w:t>NOTA :</w:t>
-            </w:r>
-            <w:proofErr w:type="gramEnd"/>
-            <w:r>
-              <w:rPr>
-                <w:rFonts w:ascii="Gordita Light" w:hAnsi="Gordita Light" w:cs="GorditaLight"/>
-                <w:sz w:val="18"/>
-                <w:szCs w:val="18"/>
-                <w:lang w:val="es-ES"/>
-              </w:rPr>
-              <w:t xml:space="preserve"> [TEXT13]</w:t>
+          </w:p>
+          <w:p>
+            <w:pPr>
+              <w:rPr>
+                <w:rFonts w:ascii="Gordita Light" w:hAnsi="Gordita Light" w:cs="GorditaLight"/>
+                <w:sz w:val="18"/>
+                <w:szCs w:val="18"/>
+                <w:lang w:val="es-ES"/>
+              </w:rPr>
+            </w:pPr>
+            <w:r>
+              <w:rPr>
+                <w:rFonts w:ascii="Gordita Light" w:hAnsi="Gordita Light" w:cs="GorditaLight"/>
+                <w:sz w:val="18"/>
+                <w:szCs w:val="18"/>
+                <w:lang w:val="es-ES"/>
+              </w:rPr>
+              <w:t>NOTA: Los límites máximos se han definido según los materiales empleados, considerados por la norma, y los datos aportados por el fabricante de cada componente/material.</w:t>
             </w:r>
           </w:p>
         </w:tc>
@@ -6419,73 +6437,11 @@
         <w:spacing w:after="0"/>
         <w:rPr>
           <w:rFonts w:ascii="Gordita Light" w:hAnsi="Gordita Light" w:cs="GorditaLight"/>
+          <w:b/>
+          <w:bCs/>
           <w:color w:val="4F83BE"/>
-          <w:lang w:val="es-ES"/>
-        </w:rPr>
-      </w:pPr>
-    </w:p>
-    <w:p>
-      <w:pPr>
-        <w:spacing w:after="0"/>
-        <w:ind w:firstLine="720"/>
-        <w:rPr>
-          <w:rFonts w:ascii="Gordita Light" w:hAnsi="Gordita Light" w:cs="GorditaLight"/>
-          <w:color w:val="4F83BE"/>
-          <w:lang w:val="es-ES"/>
-        </w:rPr>
-      </w:pPr>
-    </w:p>
-    <w:p>
-      <w:pPr>
-        <w:spacing w:after="0"/>
-        <w:ind w:firstLine="720"/>
-        <w:rPr>
-          <w:rFonts w:ascii="Gordita Light" w:hAnsi="Gordita Light" w:cs="GorditaLight"/>
-          <w:color w:val="4F83BE"/>
-          <w:lang w:val="es-ES"/>
-        </w:rPr>
-      </w:pPr>
-    </w:p>
-    <w:p>
-      <w:pPr>
-        <w:spacing w:after="0"/>
-        <w:ind w:firstLine="720"/>
-        <w:rPr>
-          <w:rFonts w:ascii="Gordita Light" w:hAnsi="Gordita Light" w:cs="GorditaLight"/>
-          <w:color w:val="4F83BE"/>
-          <w:lang w:val="es-ES"/>
-        </w:rPr>
-      </w:pPr>
-    </w:p>
-    <w:p>
-      <w:pPr>
-        <w:spacing w:after="0"/>
-        <w:ind w:firstLine="720"/>
-        <w:rPr>
-          <w:rFonts w:ascii="Gordita Light" w:hAnsi="Gordita Light" w:cs="GorditaLight"/>
-          <w:color w:val="4F83BE"/>
-          <w:lang w:val="es-ES"/>
-        </w:rPr>
-      </w:pPr>
-    </w:p>
-    <w:p>
-      <w:pPr>
-        <w:spacing w:after="0"/>
-        <w:ind w:firstLine="720"/>
-        <w:rPr>
-          <w:rFonts w:ascii="Gordita Light" w:hAnsi="Gordita Light" w:cs="GorditaLight"/>
-          <w:color w:val="4F83BE"/>
-          <w:lang w:val="es-ES"/>
-        </w:rPr>
-      </w:pPr>
-    </w:p>
-    <w:p>
-      <w:pPr>
-        <w:spacing w:after="0"/>
-        <w:ind w:firstLine="720"/>
-        <w:rPr>
-          <w:rFonts w:ascii="Gordita Light" w:hAnsi="Gordita Light" w:cs="GorditaLight"/>
-          <w:color w:val="4F83BE"/>
+          <w:sz w:val="18"/>
+          <w:szCs w:val="18"/>
           <w:lang w:val="es-ES"/>
         </w:rPr>
       </w:pPr>
@@ -6495,7 +6451,11 @@
         <w:spacing w:after="0"/>
         <w:rPr>
           <w:rFonts w:ascii="Gordita Light" w:hAnsi="Gordita Light" w:cs="GorditaLight"/>
+          <w:b/>
+          <w:bCs/>
           <w:color w:val="4F83BE"/>
+          <w:sz w:val="18"/>
+          <w:szCs w:val="18"/>
           <w:lang w:val="es-ES"/>
         </w:rPr>
       </w:pPr>
@@ -6617,6 +6577,61 @@
           <w:lang w:val="es-ES"/>
         </w:rPr>
       </w:pPr>
+    </w:p>
+    <w:p>
+      <w:pPr>
+        <w:spacing w:after="0"/>
+        <w:rPr>
+          <w:rFonts w:ascii="Gordita Light" w:hAnsi="Gordita Light" w:cs="GorditaLight"/>
+          <w:sz w:val="18"/>
+          <w:szCs w:val="18"/>
+          <w:lang w:val="es-ES"/>
+        </w:rPr>
+      </w:pPr>
+      <w:r>
+        <w:rPr>
+          <w:rFonts w:ascii="Gordita Light" w:hAnsi="Gordita Light" w:cs="GorditaLight"/>
+          <w:b/>
+          <w:bCs/>
+          <w:sz w:val="18"/>
+          <w:szCs w:val="18"/>
+          <w:lang w:val="es-ES"/>
+        </w:rPr>
+        <w:t xml:space="preserve">Periodo de </w:t>
+      </w:r>
+      <w:proofErr w:type="gramStart"/>
+      <w:r>
+        <w:rPr>
+          <w:rFonts w:ascii="Gordita Light" w:hAnsi="Gordita Light" w:cs="GorditaLight"/>
+          <w:b/>
+          <w:bCs/>
+          <w:sz w:val="18"/>
+          <w:szCs w:val="18"/>
+          <w:lang w:val="es-ES"/>
+        </w:rPr>
+        <w:t>estabilización</w:t>
+      </w:r>
+      <w:r>
+        <w:rPr>
+          <w:rFonts w:ascii="Gordita Light" w:hAnsi="Gordita Light" w:cs="GorditaLight"/>
+          <w:b/>
+          <w:bCs/>
+          <w:sz w:val="18"/>
+          <w:szCs w:val="18"/>
+          <w:lang w:val="es-ES"/>
+        </w:rPr>
+        <w:t xml:space="preserve"> :</w:t>
+      </w:r>
+      <w:proofErr w:type="gramEnd"/>
+      <w:r>
+        <w:rPr>
+          <w:rFonts w:ascii="Gordita Light" w:hAnsi="Gordita Light" w:cs="GorditaLight"/>
+          <w:sz w:val="18"/>
+          <w:szCs w:val="18"/>
+          <w:lang w:val="es-ES"/>
+        </w:rPr>
+        <w:t xml:space="preserve"> </w:t>
+      </w:r>
       <w:r>
         <w:rPr>
           <w:rFonts w:ascii="Gordita Light" w:hAnsi="Gordita Light" w:cs="GorditaLight"/>
@@ -6638,6 +6653,18 @@
           <w:lang w:val="es-ES"/>
         </w:rPr>
       </w:pPr>
+    </w:p>
+    <w:p>
+      <w:pPr>
+        <w:spacing w:after="0"/>
+        <w:jc w:val="both"/>
+        <w:rPr>
+          <w:rFonts w:ascii="Gordita Light" w:hAnsi="Gordita Light" w:cs="GorditaLight"/>
+          <w:sz w:val="18"/>
+          <w:szCs w:val="18"/>
+          <w:lang w:val="es-ES"/>
+        </w:rPr>
+      </w:pPr>
       <w:r>
         <w:rPr>
           <w:rFonts w:ascii="Gordita Light" w:hAnsi="Gordita Light" w:cs="GorditaLight"/>
@@ -6645,20 +6672,30 @@
           <w:szCs w:val="18"/>
           <w:lang w:val="es-ES"/>
         </w:rPr>
-        <w:t>[DESC1]</w:t>
+        <w:t xml:space="preserve">El gráfico se ha seccionado para mostrar el comportamiento térmico del arranque con un objetivo meramente </w:t>
       </w:r>
-    </w:p>
-    <w:p>
-      <w:pPr>
-        <w:spacing w:after="0"/>
-        <w:jc w:val="center"/>
+      <w:proofErr w:type="spellStart"/>
+      <w:proofErr w:type="gramStart"/>
+      <w:r>
         <w:rPr>
           <w:rFonts w:ascii="Gordita Light" w:hAnsi="Gordita Light" w:cs="GorditaLight"/>
           <w:sz w:val="18"/>
           <w:szCs w:val="18"/>
           <w:lang w:val="es-ES"/>
         </w:rPr>
-      </w:pPr>
+        <w:t>informativo.Para</w:t>
+      </w:r>
+      <w:proofErr w:type="spellEnd"/>
+      <w:proofErr w:type="gramEnd"/>
+      <w:r>
+        <w:rPr>
+          <w:rFonts w:ascii="Gordita Light" w:hAnsi="Gordita Light" w:cs="GorditaLight"/>
+          <w:sz w:val="18"/>
+          <w:szCs w:val="18"/>
+          <w:lang w:val="es-ES"/>
+        </w:rPr>
+        <w:t xml:space="preserve"> la verificación del cumplimiento normativo, debe tomarse únicamente la segunda parte donde las temperaturas ya están estabilizadas.</w:t>
+      </w:r>
     </w:p>
     <w:p>
       <w:pPr>
@@ -6713,6 +6750,18 @@
           <w:lang w:val="es-ES"/>
         </w:rPr>
       </w:pPr>
+    </w:p>
+    <w:p>
+      <w:pPr>
+        <w:spacing w:after="0"/>
+        <w:jc w:val="center"/>
+        <w:rPr>
+          <w:rFonts w:ascii="Gordita Light" w:hAnsi="Gordita Light" w:cs="GorditaLight"/>
+          <w:sz w:val="18"/>
+          <w:szCs w:val="18"/>
+          <w:lang w:val="es-ES"/>
+        </w:rPr>
+      </w:pPr>
       <w:r>
         <w:rPr>
           <w:rFonts w:ascii="Gordita Light" w:hAnsi="Gordita Light" w:cs="GorditaLight"/>
@@ -6720,37 +6769,8 @@
           <w:szCs w:val="18"/>
           <w:lang w:val="es-ES"/>
         </w:rPr>
-        <w:t>[DESC</w:t>
+        <w:t>Valor mínimo y máximo alanzado en cada punto de medición durante todo el ensayo</w:t>
       </w:r>
-      <w:r>
-        <w:rPr>
-          <w:rFonts w:ascii="Gordita Light" w:hAnsi="Gordita Light" w:cs="GorditaLight"/>
-          <w:sz w:val="18"/>
-          <w:szCs w:val="18"/>
-          <w:lang w:val="es-ES"/>
-        </w:rPr>
-        <w:t>2</w:t>
-      </w:r>
-      <w:r>
-        <w:rPr>
-          <w:rFonts w:ascii="Gordita Light" w:hAnsi="Gordita Light" w:cs="GorditaLight"/>
-          <w:sz w:val="18"/>
-          <w:szCs w:val="18"/>
-          <w:lang w:val="es-ES"/>
-        </w:rPr>
-        <w:t>]</w:t>
-      </w:r>
-    </w:p>
-    <w:p>
-      <w:pPr>
-        <w:spacing w:after="0"/>
-        <w:rPr>
-          <w:rFonts w:ascii="Gordita Light" w:hAnsi="Gordita Light" w:cs="GorditaLight"/>
-          <w:sz w:val="18"/>
-          <w:szCs w:val="18"/>
-          <w:lang w:val="es-ES"/>
-        </w:rPr>
-      </w:pPr>
     </w:p>
     <w:p>
       <w:pPr>
@@ -6799,6 +6819,7 @@
           <w:color w:val="4F83BE"/>
           <w:sz w:val="18"/>
           <w:szCs w:val="18"/>
+          <w:lang w:val="es-ES"/>
           <w14:textFill>
             <w14:solidFill>
               <w14:srgbClr w14:val="4F83BE">
@@ -6819,6 +6840,7 @@
           <w:color w:val="4F83BE"/>
           <w:sz w:val="18"/>
           <w:szCs w:val="18"/>
+          <w:lang w:val="es-ES"/>
           <w14:textFill>
             <w14:solidFill>
               <w14:srgbClr w14:val="4F83BE">
@@ -6847,6 +6869,7 @@
     <w:p>
       <w:pPr>
         <w:spacing w:after="0"/>
+        <w:jc w:val="both"/>
         <w:rPr>
           <w:rFonts w:ascii="Gordita Light" w:hAnsi="Gordita Light" w:cs="GorditaLight"/>
           <w:sz w:val="18"/>
@@ -6867,6 +6890,7 @@
     <w:p>
       <w:pPr>
         <w:spacing w:after="0"/>
+        <w:jc w:val="both"/>
         <w:rPr>
           <w:rFonts w:ascii="Gordita Light" w:hAnsi="Gordita Light" w:cs="GorditaLight"/>
           <w:sz w:val="18"/>
@@ -6878,6 +6902,7 @@
     <w:p>
       <w:pPr>
         <w:spacing w:after="0"/>
+        <w:jc w:val="both"/>
         <w:rPr>
           <w:rFonts w:ascii="Gordita Light" w:hAnsi="Gordita Light" w:cs="GorditaLight"/>
           <w:sz w:val="18"/>
@@ -6898,6 +6923,7 @@
     <w:p>
       <w:pPr>
         <w:spacing w:after="0"/>
+        <w:jc w:val="both"/>
         <w:rPr>
           <w:rFonts w:ascii="Gordita Light" w:hAnsi="Gordita Light" w:cs="GorditaLight"/>
           <w:sz w:val="18"/>
@@ -6909,6 +6935,7 @@
     <w:p>
       <w:pPr>
         <w:spacing w:after="0"/>
+        <w:jc w:val="both"/>
         <w:rPr>
           <w:rFonts w:ascii="Gordita Light" w:hAnsi="Gordita Light" w:cs="GorditaLight"/>
           <w:sz w:val="18"/>
@@ -6981,7 +7008,6 @@
                 <w:szCs w:val="18"/>
                 <w:lang w:val="es-ES"/>
               </w:rPr>
-              <w:lastRenderedPageBreak/>
               <w:t>Punto de Medición</w:t>
             </w:r>
           </w:p>
@@ -7504,6 +7530,7 @@
                 <w:szCs w:val="18"/>
                 <w:lang w:val="es-ES"/>
               </w:rPr>
+              <w:lastRenderedPageBreak/>
               <w:t>[MEDICI1]</w:t>
             </w:r>
           </w:p>
@@ -10494,61 +10521,6 @@
         <w:spacing w:after="0"/>
         <w:rPr>
           <w:rFonts w:ascii="Gordita Light" w:hAnsi="Gordita Light" w:cs="GorditaLight"/>
-          <w:sz w:val="18"/>
-          <w:szCs w:val="18"/>
-          <w:lang w:val="es-ES"/>
-        </w:rPr>
-      </w:pPr>
-    </w:p>
-    <w:p>
-      <w:pPr>
-        <w:spacing w:after="0"/>
-        <w:rPr>
-          <w:rFonts w:ascii="Gordita Light" w:hAnsi="Gordita Light" w:cs="GorditaLight"/>
-          <w:sz w:val="18"/>
-          <w:szCs w:val="18"/>
-          <w:lang w:val="es-ES"/>
-        </w:rPr>
-      </w:pPr>
-    </w:p>
-    <w:p>
-      <w:pPr>
-        <w:spacing w:after="0"/>
-        <w:rPr>
-          <w:rFonts w:ascii="Gordita Light" w:hAnsi="Gordita Light" w:cs="GorditaLight"/>
-          <w:sz w:val="18"/>
-          <w:szCs w:val="18"/>
-          <w:lang w:val="es-ES"/>
-        </w:rPr>
-      </w:pPr>
-    </w:p>
-    <w:p>
-      <w:pPr>
-        <w:spacing w:after="0"/>
-        <w:rPr>
-          <w:rFonts w:ascii="Gordita Light" w:hAnsi="Gordita Light" w:cs="GorditaLight"/>
-          <w:sz w:val="18"/>
-          <w:szCs w:val="18"/>
-          <w:lang w:val="es-ES"/>
-        </w:rPr>
-      </w:pPr>
-    </w:p>
-    <w:p>
-      <w:pPr>
-        <w:spacing w:after="0"/>
-        <w:rPr>
-          <w:rFonts w:ascii="Gordita Light" w:hAnsi="Gordita Light" w:cs="GorditaLight"/>
-          <w:sz w:val="18"/>
-          <w:szCs w:val="18"/>
-          <w:lang w:val="es-ES"/>
-        </w:rPr>
-      </w:pPr>
-    </w:p>
-    <w:p>
-      <w:pPr>
-        <w:spacing w:after="0"/>
-        <w:rPr>
-          <w:rFonts w:ascii="Gordita Light" w:hAnsi="Gordita Light" w:cs="GorditaLight"/>
           <w:b/>
           <w:bCs/>
           <w:color w:val="4F83BE"/>
@@ -10592,6 +10564,7 @@
           <w:color w:val="4F83BE"/>
           <w:sz w:val="18"/>
           <w:szCs w:val="18"/>
+          <w:lang w:val="es-ES"/>
           <w14:textFill>
             <w14:solidFill>
               <w14:srgbClr w14:val="4F83BE">
@@ -10612,6 +10585,7 @@
           <w:color w:val="4F83BE"/>
           <w:sz w:val="18"/>
           <w:szCs w:val="18"/>
+          <w:lang w:val="es-ES"/>
           <w14:textFill>
             <w14:solidFill>
               <w14:srgbClr w14:val="4F83BE">
@@ -10631,63 +10605,29 @@
         <w:spacing w:after="0"/>
         <w:rPr>
           <w:rFonts w:ascii="Gordita Light" w:hAnsi="Gordita Light" w:cs="GorditaLight"/>
-          <w:b/>
-          <w:bCs/>
+          <w:i/>
+          <w:iCs/>
           <w:color w:val="4F83BE"/>
           <w:sz w:val="18"/>
           <w:szCs w:val="18"/>
           <w:lang w:val="es-ES"/>
+          <w14:textFill>
+            <w14:solidFill>
+              <w14:srgbClr w14:val="4F83BE">
+                <w14:tint w14:val="66000"/>
+                <w14:satMod w14:val="160000"/>
+                <w14:tint w14:val="66000"/>
+                <w14:satMod w14:val="160000"/>
+              </w14:srgbClr>
+            </w14:solidFill>
+          </w14:textFill>
         </w:rPr>
       </w:pPr>
     </w:p>
-    <w:tbl>
-      <w:tblPr>
-        <w:tblStyle w:val="TableGrid"/>
-        <w:tblW w:w="0" w:type="auto"/>
-        <w:tblInd w:w="1129" w:type="dxa"/>
-        <w:tblBorders>
-          <w:top w:val="none" w:sz="0" w:space="0" w:color="auto"/>
-          <w:left w:val="none" w:sz="0" w:space="0" w:color="auto"/>
-          <w:bottom w:val="none" w:sz="0" w:space="0" w:color="auto"/>
-          <w:right w:val="none" w:sz="0" w:space="0" w:color="auto"/>
-          <w:insideH w:val="none" w:sz="0" w:space="0" w:color="auto"/>
-          <w:insideV w:val="none" w:sz="0" w:space="0" w:color="auto"/>
-        </w:tblBorders>
-        <w:tblLook w:val="04A0" w:firstRow="1" w:lastRow="0" w:firstColumn="1" w:lastColumn="0" w:noHBand="0" w:noVBand="1"/>
-      </w:tblPr>
-      <w:tblGrid>
-        <w:gridCol w:w="7501"/>
-      </w:tblGrid>
-      <w:tr>
-        <w:tc>
-          <w:tcPr>
-            <w:tcW w:w="7501" w:type="dxa"/>
-          </w:tcPr>
-          <w:p>
-            <w:pPr>
-              <w:rPr>
-                <w:rFonts w:ascii="Gordita Light" w:hAnsi="Gordita Light" w:cs="GorditaLight"/>
-                <w:sz w:val="18"/>
-                <w:szCs w:val="18"/>
-                <w:lang w:val="es-ES"/>
-              </w:rPr>
-            </w:pPr>
-            <w:r>
-              <w:rPr>
-                <w:rFonts w:ascii="Gordita Light" w:hAnsi="Gordita Light" w:cs="GorditaLight"/>
-                <w:sz w:val="18"/>
-                <w:szCs w:val="18"/>
-                <w:lang w:val="es-ES"/>
-              </w:rPr>
-              <w:t>[TEXT15]</w:t>
-            </w:r>
-          </w:p>
-        </w:tc>
-      </w:tr>
-    </w:tbl>
     <w:p>
       <w:pPr>
         <w:spacing w:after="0"/>
+        <w:jc w:val="both"/>
         <w:rPr>
           <w:rFonts w:ascii="Gordita Light" w:hAnsi="Gordita Light" w:cs="GorditaLight"/>
           <w:sz w:val="18"/>
@@ -10695,6 +10635,35 @@
           <w:lang w:val="es-ES"/>
         </w:rPr>
       </w:pPr>
+      <w:r>
+        <w:rPr>
+          <w:rFonts w:ascii="Gordita Light" w:hAnsi="Gordita Light" w:cs="GorditaLight"/>
+          <w:sz w:val="18"/>
+          <w:szCs w:val="18"/>
+          <w:lang w:val="es-ES"/>
+        </w:rPr>
+        <w:t xml:space="preserve">Tras el ensayo en funcionamiento normal de la muestra, se observa que los valores obtenidos se encuentran dentro de los límites establecidos </w:t>
+      </w:r>
+      <w:proofErr w:type="gramStart"/>
+      <w:r>
+        <w:rPr>
+          <w:rFonts w:ascii="Gordita Light" w:hAnsi="Gordita Light" w:cs="GorditaLight"/>
+          <w:sz w:val="18"/>
+          <w:szCs w:val="18"/>
+          <w:lang w:val="es-ES"/>
+        </w:rPr>
+        <w:t>y</w:t>
+      </w:r>
+      <w:proofErr w:type="gramEnd"/>
+      <w:r>
+        <w:rPr>
+          <w:rFonts w:ascii="Gordita Light" w:hAnsi="Gordita Light" w:cs="GorditaLight"/>
+          <w:sz w:val="18"/>
+          <w:szCs w:val="18"/>
+          <w:lang w:val="es-ES"/>
+        </w:rPr>
+        <w:t xml:space="preserve"> por lo tanto, CUMPLEN los requisitos de la norma.</w:t>
+      </w:r>
     </w:p>
     <w:p>
       <w:pPr>
@@ -10742,106 +10711,6 @@
           <w:color w:val="4F83BE"/>
           <w:sz w:val="18"/>
           <w:szCs w:val="18"/>
-          <w:lang w:val="es-ES"/>
-        </w:rPr>
-      </w:pPr>
-    </w:p>
-    <w:p>
-      <w:pPr>
-        <w:spacing w:after="0"/>
-        <w:rPr>
-          <w:rFonts w:ascii="Gordita Light" w:hAnsi="Gordita Light" w:cs="GorditaLight"/>
-          <w:color w:val="4F83BE"/>
-          <w:lang w:val="es-ES"/>
-        </w:rPr>
-      </w:pPr>
-    </w:p>
-    <w:p>
-      <w:pPr>
-        <w:spacing w:after="0"/>
-        <w:rPr>
-          <w:rFonts w:ascii="Gordita Light" w:hAnsi="Gordita Light" w:cs="GorditaLight"/>
-          <w:color w:val="4F83BE"/>
-          <w:lang w:val="es-ES"/>
-        </w:rPr>
-      </w:pPr>
-    </w:p>
-    <w:p>
-      <w:pPr>
-        <w:spacing w:after="0"/>
-        <w:rPr>
-          <w:rFonts w:ascii="Gordita Light" w:hAnsi="Gordita Light" w:cs="GorditaLight"/>
-          <w:color w:val="4F83BE"/>
-          <w:lang w:val="es-ES"/>
-        </w:rPr>
-      </w:pPr>
-    </w:p>
-    <w:p>
-      <w:pPr>
-        <w:spacing w:after="0"/>
-        <w:rPr>
-          <w:rFonts w:ascii="Gordita Light" w:hAnsi="Gordita Light" w:cs="GorditaLight"/>
-          <w:color w:val="4F83BE"/>
-          <w:lang w:val="es-ES"/>
-        </w:rPr>
-      </w:pPr>
-    </w:p>
-    <w:p>
-      <w:pPr>
-        <w:spacing w:after="0"/>
-        <w:rPr>
-          <w:rFonts w:ascii="Gordita Light" w:hAnsi="Gordita Light" w:cs="GorditaLight"/>
-          <w:color w:val="4F83BE"/>
-          <w:lang w:val="es-ES"/>
-        </w:rPr>
-      </w:pPr>
-    </w:p>
-    <w:p>
-      <w:pPr>
-        <w:spacing w:after="0"/>
-        <w:rPr>
-          <w:rFonts w:ascii="Gordita Light" w:hAnsi="Gordita Light" w:cs="GorditaLight"/>
-          <w:color w:val="4F83BE"/>
-          <w:lang w:val="es-ES"/>
-        </w:rPr>
-      </w:pPr>
-    </w:p>
-    <w:p>
-      <w:pPr>
-        <w:spacing w:after="0"/>
-        <w:rPr>
-          <w:rFonts w:ascii="Gordita Light" w:hAnsi="Gordita Light" w:cs="GorditaLight"/>
-          <w:color w:val="4F83BE"/>
-          <w:lang w:val="es-ES"/>
-        </w:rPr>
-      </w:pPr>
-    </w:p>
-    <w:p>
-      <w:pPr>
-        <w:spacing w:after="0"/>
-        <w:rPr>
-          <w:rFonts w:ascii="Gordita Light" w:hAnsi="Gordita Light" w:cs="GorditaLight"/>
-          <w:color w:val="4F83BE"/>
-          <w:lang w:val="es-ES"/>
-        </w:rPr>
-      </w:pPr>
-    </w:p>
-    <w:p>
-      <w:pPr>
-        <w:spacing w:after="0"/>
-        <w:rPr>
-          <w:rFonts w:ascii="Gordita Light" w:hAnsi="Gordita Light" w:cs="GorditaLight"/>
-          <w:color w:val="4F83BE"/>
-          <w:lang w:val="es-ES"/>
-        </w:rPr>
-      </w:pPr>
-    </w:p>
-    <w:p>
-      <w:pPr>
-        <w:spacing w:after="0"/>
-        <w:rPr>
-          <w:rFonts w:ascii="Gordita Light" w:hAnsi="Gordita Light" w:cs="GorditaLight"/>
-          <w:color w:val="4F83BE"/>
           <w:lang w:val="es-ES"/>
         </w:rPr>
       </w:pPr>
@@ -10991,6 +10860,7 @@
                 <w:szCs w:val="18"/>
                 <w:lang w:val="es-ES"/>
               </w:rPr>
+              <w:lastRenderedPageBreak/>
               <w:t>[TITLE3]</w:t>
             </w:r>
           </w:p>
@@ -11144,7 +11014,6 @@
                 <w:sz w:val="18"/>
                 <w:szCs w:val="18"/>
               </w:rPr>
-              <w:lastRenderedPageBreak/>
               <w:t>[TITLE5]</w:t>
             </w:r>
           </w:p>
@@ -11599,7 +11468,6 @@
                 <w:sz w:val="18"/>
                 <w:szCs w:val="18"/>
               </w:rPr>
-              <w:lastRenderedPageBreak/>
               <w:t>[TITLE</w:t>
             </w:r>
             <w:r>
@@ -11862,6 +11730,7 @@
                 <w:sz w:val="18"/>
                 <w:szCs w:val="18"/>
               </w:rPr>
+              <w:lastRenderedPageBreak/>
               <w:t>[TITLE</w:t>
             </w:r>
             <w:r>
@@ -12019,6 +11888,263 @@
               <w:rPr>
                 <w:rFonts w:ascii="Gordita Light" w:hAnsi="Gordita Light" w:cs="GorditaLight"/>
                 <w:color w:val="4F83BE"/>
+              </w:rPr>
+            </w:pPr>
+          </w:p>
+        </w:tc>
+      </w:tr>
+    </w:tbl>
+    <w:p>
+      <w:pPr>
+        <w:spacing w:after="0"/>
+        <w:rPr>
+          <w:rFonts w:ascii="Gordita Light" w:hAnsi="Gordita Light" w:cs="GorditaLight"/>
+          <w:color w:val="4F83BE"/>
+        </w:rPr>
+      </w:pPr>
+    </w:p>
+    <w:tbl>
+      <w:tblPr>
+        <w:tblStyle w:val="TableGrid"/>
+        <w:tblW w:w="0" w:type="auto"/>
+        <w:tblBorders>
+          <w:top w:val="none" w:sz="0" w:space="0" w:color="auto"/>
+          <w:left w:val="none" w:sz="0" w:space="0" w:color="auto"/>
+          <w:bottom w:val="none" w:sz="0" w:space="0" w:color="auto"/>
+          <w:right w:val="none" w:sz="0" w:space="0" w:color="auto"/>
+          <w:insideH w:val="none" w:sz="0" w:space="0" w:color="auto"/>
+          <w:insideV w:val="none" w:sz="0" w:space="0" w:color="auto"/>
+        </w:tblBorders>
+        <w:tblLook w:val="04A0" w:firstRow="1" w:lastRow="0" w:firstColumn="1" w:lastColumn="0" w:noHBand="0" w:noVBand="1"/>
+      </w:tblPr>
+      <w:tblGrid>
+        <w:gridCol w:w="4315"/>
+        <w:gridCol w:w="4315"/>
+      </w:tblGrid>
+      <w:tr>
+        <w:trPr>
+          <w:trHeight w:val="5391"/>
+        </w:trPr>
+        <w:tc>
+          <w:tcPr>
+            <w:tcW w:w="4315" w:type="dxa"/>
+          </w:tcPr>
+          <w:p>
+            <w:pPr>
+              <w:jc w:val="center"/>
+              <w:rPr>
+                <w:rFonts w:ascii="Gordita Light" w:hAnsi="Gordita Light" w:cs="GorditaLight"/>
+                <w:sz w:val="18"/>
+                <w:szCs w:val="18"/>
+              </w:rPr>
+            </w:pPr>
+            <w:r>
+              <w:rPr>
+                <w:rFonts w:ascii="Gordita Light" w:hAnsi="Gordita Light" w:cs="GorditaLight"/>
+                <w:sz w:val="18"/>
+                <w:szCs w:val="18"/>
+              </w:rPr>
+              <w:t>[TITLE</w:t>
+            </w:r>
+            <w:r>
+              <w:rPr>
+                <w:rFonts w:ascii="Gordita Light" w:hAnsi="Gordita Light" w:cs="GorditaLight"/>
+                <w:sz w:val="18"/>
+                <w:szCs w:val="18"/>
+              </w:rPr>
+              <w:t>13</w:t>
+            </w:r>
+            <w:r>
+              <w:rPr>
+                <w:rFonts w:ascii="Gordita Light" w:hAnsi="Gordita Light" w:cs="GorditaLight"/>
+                <w:sz w:val="18"/>
+                <w:szCs w:val="18"/>
+              </w:rPr>
+              <w:t>]</w:t>
+            </w:r>
+          </w:p>
+          <w:p>
+            <w:pPr>
+              <w:jc w:val="center"/>
+              <w:rPr>
+                <w:rFonts w:ascii="Gordita Light" w:hAnsi="Gordita Light" w:cs="GorditaLight"/>
+                <w:sz w:val="18"/>
+                <w:szCs w:val="18"/>
+              </w:rPr>
+            </w:pPr>
+          </w:p>
+          <w:p>
+            <w:pPr>
+              <w:jc w:val="center"/>
+              <w:rPr>
+                <w:rFonts w:ascii="Gordita Light" w:hAnsi="Gordita Light" w:cs="GorditaLight"/>
+                <w:color w:val="4F83BE"/>
+              </w:rPr>
+            </w:pPr>
+            <w:r>
+              <w:rPr>
+                <w:rFonts w:ascii="Gordita Light" w:hAnsi="Gordita Light" w:cs="GorditaLight"/>
+                <w:sz w:val="18"/>
+                <w:szCs w:val="18"/>
+              </w:rPr>
+              <w:t>[IMAGE</w:t>
+            </w:r>
+            <w:r>
+              <w:rPr>
+                <w:rFonts w:ascii="Gordita Light" w:hAnsi="Gordita Light" w:cs="GorditaLight"/>
+                <w:sz w:val="18"/>
+                <w:szCs w:val="18"/>
+              </w:rPr>
+              <w:t>13</w:t>
+            </w:r>
+            <w:r>
+              <w:rPr>
+                <w:rFonts w:ascii="Gordita Light" w:hAnsi="Gordita Light" w:cs="GorditaLight"/>
+                <w:sz w:val="18"/>
+                <w:szCs w:val="18"/>
+              </w:rPr>
+              <w:t>]</w:t>
+            </w:r>
+          </w:p>
+          <w:p>
+            <w:pPr>
+              <w:rPr>
+                <w:rFonts w:ascii="Gordita Light" w:hAnsi="Gordita Light" w:cs="GorditaLight"/>
+                <w:i/>
+                <w:iCs/>
+                <w:color w:val="4F83BE"/>
+                <w:sz w:val="18"/>
+                <w:szCs w:val="18"/>
+                <w14:textFill>
+                  <w14:solidFill>
+                    <w14:srgbClr w14:val="4F83BE">
+                      <w14:tint w14:val="66000"/>
+                      <w14:satMod w14:val="160000"/>
+                      <w14:tint w14:val="66000"/>
+                      <w14:satMod w14:val="160000"/>
+                    </w14:srgbClr>
+                  </w14:solidFill>
+                </w14:textFill>
+              </w:rPr>
+            </w:pPr>
+          </w:p>
+        </w:tc>
+        <w:tc>
+          <w:tcPr>
+            <w:tcW w:w="4315" w:type="dxa"/>
+          </w:tcPr>
+          <w:p>
+            <w:pPr>
+              <w:jc w:val="center"/>
+              <w:rPr>
+                <w:rFonts w:ascii="Gordita Light" w:hAnsi="Gordita Light" w:cs="GorditaLight"/>
+                <w:sz w:val="18"/>
+                <w:szCs w:val="18"/>
+              </w:rPr>
+            </w:pPr>
+            <w:r>
+              <w:rPr>
+                <w:rFonts w:ascii="Gordita Light" w:hAnsi="Gordita Light" w:cs="GorditaLight"/>
+                <w:sz w:val="18"/>
+                <w:szCs w:val="18"/>
+              </w:rPr>
+              <w:t>[TITLE</w:t>
+            </w:r>
+            <w:r>
+              <w:rPr>
+                <w:rFonts w:ascii="Gordita Light" w:hAnsi="Gordita Light" w:cs="GorditaLight"/>
+                <w:sz w:val="18"/>
+                <w:szCs w:val="18"/>
+              </w:rPr>
+              <w:t>1</w:t>
+            </w:r>
+            <w:r>
+              <w:rPr>
+                <w:rFonts w:ascii="Gordita Light" w:hAnsi="Gordita Light" w:cs="GorditaLight"/>
+                <w:sz w:val="18"/>
+                <w:szCs w:val="18"/>
+              </w:rPr>
+              <w:t>4</w:t>
+            </w:r>
+            <w:r>
+              <w:rPr>
+                <w:rFonts w:ascii="Gordita Light" w:hAnsi="Gordita Light" w:cs="GorditaLight"/>
+                <w:sz w:val="18"/>
+                <w:szCs w:val="18"/>
+              </w:rPr>
+              <w:t>]</w:t>
+            </w:r>
+          </w:p>
+          <w:p>
+            <w:pPr>
+              <w:jc w:val="center"/>
+              <w:rPr>
+                <w:rFonts w:ascii="Gordita Light" w:hAnsi="Gordita Light" w:cs="GorditaLight"/>
+                <w:sz w:val="18"/>
+                <w:szCs w:val="18"/>
+              </w:rPr>
+            </w:pPr>
+          </w:p>
+          <w:p>
+            <w:pPr>
+              <w:jc w:val="center"/>
+              <w:rPr>
+                <w:rFonts w:ascii="Gordita Light" w:hAnsi="Gordita Light" w:cs="GorditaLight"/>
+                <w:color w:val="4F83BE"/>
+              </w:rPr>
+            </w:pPr>
+            <w:r>
+              <w:rPr>
+                <w:rFonts w:ascii="Gordita Light" w:hAnsi="Gordita Light" w:cs="GorditaLight"/>
+                <w:sz w:val="18"/>
+                <w:szCs w:val="18"/>
+              </w:rPr>
+              <w:t>[IMAGE</w:t>
+            </w:r>
+            <w:r>
+              <w:rPr>
+                <w:rFonts w:ascii="Gordita Light" w:hAnsi="Gordita Light" w:cs="GorditaLight"/>
+                <w:sz w:val="18"/>
+                <w:szCs w:val="18"/>
+              </w:rPr>
+              <w:t>1</w:t>
+            </w:r>
+            <w:r>
+              <w:rPr>
+                <w:rFonts w:ascii="Gordita Light" w:hAnsi="Gordita Light" w:cs="GorditaLight"/>
+                <w:sz w:val="18"/>
+                <w:szCs w:val="18"/>
+              </w:rPr>
+              <w:t>4</w:t>
+            </w:r>
+            <w:r>
+              <w:rPr>
+                <w:rFonts w:ascii="Gordita Light" w:hAnsi="Gordita Light" w:cs="GorditaLight"/>
+                <w:sz w:val="18"/>
+                <w:szCs w:val="18"/>
+              </w:rPr>
+              <w:t>]</w:t>
+            </w:r>
+          </w:p>
+          <w:p>
+            <w:pPr>
+              <w:rPr>
+                <w:rFonts w:ascii="Gordita Light" w:hAnsi="Gordita Light" w:cs="GorditaLight"/>
+                <w:i/>
+                <w:iCs/>
+                <w:color w:val="4F83BE"/>
+                <w:sz w:val="18"/>
+                <w:szCs w:val="18"/>
+                <w14:textFill>
+                  <w14:solidFill>
+                    <w14:srgbClr w14:val="4F83BE">
+                      <w14:tint w14:val="66000"/>
+                      <w14:satMod w14:val="160000"/>
+                      <w14:tint w14:val="66000"/>
+                      <w14:satMod w14:val="160000"/>
+                    </w14:srgbClr>
+                  </w14:solidFill>
+                </w14:textFill>
               </w:rPr>
             </w:pPr>
           </w:p>
@@ -12044,42 +12170,243 @@
         </w:rPr>
       </w:pPr>
     </w:p>
-    <w:p>
-      <w:pPr>
-        <w:spacing w:after="0"/>
-        <w:rPr>
-          <w:rFonts w:ascii="Gordita Light" w:hAnsi="Gordita Light" w:cs="GorditaLight"/>
-          <w:color w:val="4F83BE"/>
-        </w:rPr>
-      </w:pPr>
-    </w:p>
-    <w:p>
-      <w:pPr>
-        <w:spacing w:after="0"/>
-        <w:rPr>
-          <w:rFonts w:ascii="Gordita Light" w:hAnsi="Gordita Light" w:cs="GorditaLight"/>
-          <w:color w:val="4F83BE"/>
-        </w:rPr>
-      </w:pPr>
-    </w:p>
-    <w:p>
-      <w:pPr>
-        <w:spacing w:after="0"/>
-        <w:rPr>
-          <w:rFonts w:ascii="Gordita Light" w:hAnsi="Gordita Light" w:cs="GorditaLight"/>
-          <w:color w:val="4F83BE"/>
-        </w:rPr>
-      </w:pPr>
-    </w:p>
-    <w:p>
-      <w:pPr>
-        <w:spacing w:after="0"/>
-        <w:rPr>
-          <w:rFonts w:ascii="Gordita Light" w:hAnsi="Gordita Light" w:cs="GorditaLight"/>
-          <w:color w:val="4F83BE"/>
-        </w:rPr>
-      </w:pPr>
-    </w:p>
+    <w:tbl>
+      <w:tblPr>
+        <w:tblStyle w:val="TableGrid"/>
+        <w:tblW w:w="0" w:type="auto"/>
+        <w:tblBorders>
+          <w:top w:val="none" w:sz="0" w:space="0" w:color="auto"/>
+          <w:left w:val="none" w:sz="0" w:space="0" w:color="auto"/>
+          <w:bottom w:val="none" w:sz="0" w:space="0" w:color="auto"/>
+          <w:right w:val="none" w:sz="0" w:space="0" w:color="auto"/>
+          <w:insideH w:val="none" w:sz="0" w:space="0" w:color="auto"/>
+          <w:insideV w:val="none" w:sz="0" w:space="0" w:color="auto"/>
+        </w:tblBorders>
+        <w:tblLook w:val="04A0" w:firstRow="1" w:lastRow="0" w:firstColumn="1" w:lastColumn="0" w:noHBand="0" w:noVBand="1"/>
+      </w:tblPr>
+      <w:tblGrid>
+        <w:gridCol w:w="4315"/>
+        <w:gridCol w:w="4315"/>
+      </w:tblGrid>
+      <w:tr>
+        <w:trPr>
+          <w:trHeight w:val="5108"/>
+        </w:trPr>
+        <w:tc>
+          <w:tcPr>
+            <w:tcW w:w="4315" w:type="dxa"/>
+          </w:tcPr>
+          <w:p>
+            <w:pPr>
+              <w:jc w:val="center"/>
+              <w:rPr>
+                <w:rFonts w:ascii="Gordita Light" w:hAnsi="Gordita Light" w:cs="GorditaLight"/>
+                <w:sz w:val="18"/>
+                <w:szCs w:val="18"/>
+              </w:rPr>
+            </w:pPr>
+            <w:r>
+              <w:rPr>
+                <w:rFonts w:ascii="Gordita Light" w:hAnsi="Gordita Light" w:cs="GorditaLight"/>
+                <w:sz w:val="18"/>
+                <w:szCs w:val="18"/>
+              </w:rPr>
+              <w:lastRenderedPageBreak/>
+              <w:t>[TITLE</w:t>
+            </w:r>
+            <w:r>
+              <w:rPr>
+                <w:rFonts w:ascii="Gordita Light" w:hAnsi="Gordita Light" w:cs="GorditaLight"/>
+                <w:sz w:val="18"/>
+                <w:szCs w:val="18"/>
+              </w:rPr>
+              <w:t>1</w:t>
+            </w:r>
+            <w:r>
+              <w:rPr>
+                <w:rFonts w:ascii="Gordita Light" w:hAnsi="Gordita Light" w:cs="GorditaLight"/>
+                <w:sz w:val="18"/>
+                <w:szCs w:val="18"/>
+              </w:rPr>
+              <w:t>5</w:t>
+            </w:r>
+            <w:r>
+              <w:rPr>
+                <w:rFonts w:ascii="Gordita Light" w:hAnsi="Gordita Light" w:cs="GorditaLight"/>
+                <w:sz w:val="18"/>
+                <w:szCs w:val="18"/>
+              </w:rPr>
+              <w:t>]</w:t>
+            </w:r>
+          </w:p>
+          <w:p>
+            <w:pPr>
+              <w:jc w:val="center"/>
+              <w:rPr>
+                <w:rFonts w:ascii="Gordita Light" w:hAnsi="Gordita Light" w:cs="GorditaLight"/>
+                <w:sz w:val="18"/>
+                <w:szCs w:val="18"/>
+              </w:rPr>
+            </w:pPr>
+          </w:p>
+          <w:p>
+            <w:pPr>
+              <w:jc w:val="center"/>
+              <w:rPr>
+                <w:rFonts w:ascii="Gordita Light" w:hAnsi="Gordita Light" w:cs="GorditaLight"/>
+                <w:color w:val="4F83BE"/>
+              </w:rPr>
+            </w:pPr>
+            <w:r>
+              <w:rPr>
+                <w:rFonts w:ascii="Gordita Light" w:hAnsi="Gordita Light" w:cs="GorditaLight"/>
+                <w:sz w:val="18"/>
+                <w:szCs w:val="18"/>
+              </w:rPr>
+              <w:t>[IMAGE</w:t>
+            </w:r>
+            <w:r>
+              <w:rPr>
+                <w:rFonts w:ascii="Gordita Light" w:hAnsi="Gordita Light" w:cs="GorditaLight"/>
+                <w:sz w:val="18"/>
+                <w:szCs w:val="18"/>
+              </w:rPr>
+              <w:t>1</w:t>
+            </w:r>
+            <w:r>
+              <w:rPr>
+                <w:rFonts w:ascii="Gordita Light" w:hAnsi="Gordita Light" w:cs="GorditaLight"/>
+                <w:sz w:val="18"/>
+                <w:szCs w:val="18"/>
+              </w:rPr>
+              <w:t>5</w:t>
+            </w:r>
+            <w:r>
+              <w:rPr>
+                <w:rFonts w:ascii="Gordita Light" w:hAnsi="Gordita Light" w:cs="GorditaLight"/>
+                <w:sz w:val="18"/>
+                <w:szCs w:val="18"/>
+              </w:rPr>
+              <w:t>]</w:t>
+            </w:r>
+          </w:p>
+          <w:p>
+            <w:pPr>
+              <w:rPr>
+                <w:rFonts w:ascii="Gordita Light" w:hAnsi="Gordita Light" w:cs="GorditaLight"/>
+                <w:color w:val="4F83BE"/>
+              </w:rPr>
+            </w:pPr>
+          </w:p>
+        </w:tc>
+        <w:tc>
+          <w:tcPr>
+            <w:tcW w:w="4315" w:type="dxa"/>
+          </w:tcPr>
+          <w:p>
+            <w:pPr>
+              <w:jc w:val="center"/>
+              <w:rPr>
+                <w:rFonts w:ascii="Gordita Light" w:hAnsi="Gordita Light" w:cs="GorditaLight"/>
+                <w:sz w:val="18"/>
+                <w:szCs w:val="18"/>
+              </w:rPr>
+            </w:pPr>
+            <w:r>
+              <w:rPr>
+                <w:rFonts w:ascii="Gordita Light" w:hAnsi="Gordita Light" w:cs="GorditaLight"/>
+                <w:sz w:val="18"/>
+                <w:szCs w:val="18"/>
+              </w:rPr>
+              <w:t>[TITLE</w:t>
+            </w:r>
+            <w:r>
+              <w:rPr>
+                <w:rFonts w:ascii="Gordita Light" w:hAnsi="Gordita Light" w:cs="GorditaLight"/>
+                <w:sz w:val="18"/>
+                <w:szCs w:val="18"/>
+              </w:rPr>
+              <w:t>1</w:t>
+            </w:r>
+            <w:r>
+              <w:rPr>
+                <w:rFonts w:ascii="Gordita Light" w:hAnsi="Gordita Light" w:cs="GorditaLight"/>
+                <w:sz w:val="18"/>
+                <w:szCs w:val="18"/>
+              </w:rPr>
+              <w:t>6</w:t>
+            </w:r>
+            <w:r>
+              <w:rPr>
+                <w:rFonts w:ascii="Gordita Light" w:hAnsi="Gordita Light" w:cs="GorditaLight"/>
+                <w:sz w:val="18"/>
+                <w:szCs w:val="18"/>
+              </w:rPr>
+              <w:t>]</w:t>
+            </w:r>
+          </w:p>
+          <w:p>
+            <w:pPr>
+              <w:jc w:val="center"/>
+              <w:rPr>
+                <w:rFonts w:ascii="Gordita Light" w:hAnsi="Gordita Light" w:cs="GorditaLight"/>
+                <w:sz w:val="18"/>
+                <w:szCs w:val="18"/>
+              </w:rPr>
+            </w:pPr>
+          </w:p>
+          <w:p>
+            <w:pPr>
+              <w:jc w:val="center"/>
+              <w:rPr>
+                <w:rFonts w:ascii="Gordita Light" w:hAnsi="Gordita Light" w:cs="GorditaLight"/>
+                <w:color w:val="4F83BE"/>
+              </w:rPr>
+            </w:pPr>
+            <w:r>
+              <w:rPr>
+                <w:rFonts w:ascii="Gordita Light" w:hAnsi="Gordita Light" w:cs="GorditaLight"/>
+                <w:sz w:val="18"/>
+                <w:szCs w:val="18"/>
+              </w:rPr>
+              <w:t>[IMAGE</w:t>
+            </w:r>
+            <w:r>
+              <w:rPr>
+                <w:rFonts w:ascii="Gordita Light" w:hAnsi="Gordita Light" w:cs="GorditaLight"/>
+                <w:sz w:val="18"/>
+                <w:szCs w:val="18"/>
+              </w:rPr>
+              <w:t>1</w:t>
+            </w:r>
+            <w:r>
+              <w:rPr>
+                <w:rFonts w:ascii="Gordita Light" w:hAnsi="Gordita Light" w:cs="GorditaLight"/>
+                <w:sz w:val="18"/>
+                <w:szCs w:val="18"/>
+              </w:rPr>
+              <w:t>6</w:t>
+            </w:r>
+            <w:r>
+              <w:rPr>
+                <w:rFonts w:ascii="Gordita Light" w:hAnsi="Gordita Light" w:cs="GorditaLight"/>
+                <w:sz w:val="18"/>
+                <w:szCs w:val="18"/>
+              </w:rPr>
+              <w:t>]</w:t>
+            </w:r>
+          </w:p>
+          <w:p>
+            <w:pPr>
+              <w:rPr>
+                <w:rFonts w:ascii="Gordita Light" w:hAnsi="Gordita Light" w:cs="GorditaLight"/>
+                <w:color w:val="4F83BE"/>
+              </w:rPr>
+            </w:pPr>
+          </w:p>
+        </w:tc>
+      </w:tr>
+    </w:tbl>
     <w:p>
       <w:pPr>
         <w:pStyle w:val="TOCHeading"/>

</xml_diff>

<commit_message>
final montaje add some photo
</commit_message>
<xml_diff>
--- a/templates/New_Template2.docx
+++ b/templates/New_Template2.docx
@@ -446,32 +446,8 @@
                   </w14:solidFill>
                 </w14:textFill>
               </w:rPr>
-              <w:t xml:space="preserve">Test </w:t>
-            </w:r>
-            <w:proofErr w:type="spellStart"/>
-            <w:r>
-              <w:rPr>
-                <w:rFonts w:ascii="Gordita Light" w:hAnsi="Gordita Light" w:cs="GorditaLight"/>
-                <w:i/>
-                <w:iCs/>
-                <w:color w:val="4F83BE"/>
-                <w:sz w:val="18"/>
-                <w:szCs w:val="18"/>
-                <w:lang w:val="es-ES"/>
-                <w14:textFill>
-                  <w14:solidFill>
-                    <w14:srgbClr w14:val="4F83BE">
-                      <w14:tint w14:val="66000"/>
-                      <w14:satMod w14:val="160000"/>
-                      <w14:tint w14:val="66000"/>
-                      <w14:satMod w14:val="160000"/>
-                    </w14:srgbClr>
-                  </w14:solidFill>
-                </w14:textFill>
-              </w:rPr>
-              <w:t>operator</w:t>
-            </w:r>
-            <w:proofErr w:type="spellEnd"/>
+              <w:t>Test operator</w:t>
+            </w:r>
           </w:p>
         </w:tc>
         <w:tc>
@@ -1263,9 +1239,92 @@
                   </w14:solidFill>
                 </w14:textFill>
               </w:rPr>
-              <w:t xml:space="preserve">Reference </w:t>
-            </w:r>
-            <w:proofErr w:type="gramStart"/>
+              <w:t>Reference of the tested model</w:t>
+            </w:r>
+          </w:p>
+        </w:tc>
+        <w:tc>
+          <w:tcPr>
+            <w:tcW w:w="4382" w:type="dxa"/>
+          </w:tcPr>
+          <w:p>
+            <w:pPr>
+              <w:rPr>
+                <w:rFonts w:ascii="Gordita Light" w:hAnsi="Gordita Light" w:cs="GorditaLight"/>
+                <w:sz w:val="18"/>
+                <w:szCs w:val="18"/>
+                <w:lang w:val="es-ES"/>
+              </w:rPr>
+            </w:pPr>
+            <w:r>
+              <w:rPr>
+                <w:rFonts w:ascii="Gordita Light" w:hAnsi="Gordita Light" w:cs="GorditaLight"/>
+                <w:sz w:val="18"/>
+                <w:szCs w:val="18"/>
+                <w:lang w:val="es-ES"/>
+              </w:rPr>
+              <w:t>[TEXT</w:t>
+            </w:r>
+            <w:r>
+              <w:rPr>
+                <w:rFonts w:ascii="Gordita Light" w:hAnsi="Gordita Light" w:cs="GorditaLight"/>
+                <w:sz w:val="18"/>
+                <w:szCs w:val="18"/>
+                <w:lang w:val="es-ES"/>
+              </w:rPr>
+              <w:t>6</w:t>
+            </w:r>
+            <w:r>
+              <w:rPr>
+                <w:rFonts w:ascii="Gordita Light" w:hAnsi="Gordita Light" w:cs="GorditaLight"/>
+                <w:sz w:val="18"/>
+                <w:szCs w:val="18"/>
+                <w:lang w:val="es-ES"/>
+              </w:rPr>
+              <w:t>]</w:t>
+            </w:r>
+          </w:p>
+        </w:tc>
+      </w:tr>
+      <w:tr>
+        <w:trPr>
+          <w:trHeight w:val="465"/>
+        </w:trPr>
+        <w:tc>
+          <w:tcPr>
+            <w:tcW w:w="4248" w:type="dxa"/>
+          </w:tcPr>
+          <w:p>
+            <w:pPr>
+              <w:rPr>
+                <w:rFonts w:ascii="Gordita Light" w:hAnsi="Gordita Light" w:cs="GorditaLight"/>
+                <w:color w:val="4F83BE"/>
+                <w:sz w:val="18"/>
+                <w:szCs w:val="18"/>
+                <w:lang w:val="es-ES"/>
+              </w:rPr>
+            </w:pPr>
+            <w:r>
+              <w:rPr>
+                <w:rFonts w:ascii="Gordita Light" w:hAnsi="Gordita Light" w:cs="GorditaLight"/>
+                <w:color w:val="4F83BE"/>
+                <w:sz w:val="18"/>
+                <w:szCs w:val="18"/>
+                <w:lang w:val="es-ES"/>
+              </w:rPr>
+              <w:t>Familia:</w:t>
+            </w:r>
+          </w:p>
+          <w:p>
+            <w:pPr>
+              <w:rPr>
+                <w:rFonts w:ascii="Gordita Light" w:hAnsi="Gordita Light" w:cs="GorditaLight"/>
+                <w:color w:val="4F83BE"/>
+                <w:sz w:val="18"/>
+                <w:szCs w:val="18"/>
+                <w:lang w:val="es-ES"/>
+              </w:rPr>
+            </w:pPr>
             <w:r>
               <w:rPr>
                 <w:rFonts w:ascii="Gordita Light" w:hAnsi="Gordita Light" w:cs="GorditaLight"/>
@@ -1285,9 +1344,93 @@
                   </w14:solidFill>
                 </w14:textFill>
               </w:rPr>
-              <w:t>of</w:t>
-            </w:r>
-            <w:proofErr w:type="gramEnd"/>
+              <w:t>Family</w:t>
+            </w:r>
+          </w:p>
+        </w:tc>
+        <w:tc>
+          <w:tcPr>
+            <w:tcW w:w="4382" w:type="dxa"/>
+          </w:tcPr>
+          <w:p>
+            <w:pPr>
+              <w:rPr>
+                <w:rFonts w:ascii="Gordita Light" w:hAnsi="Gordita Light" w:cs="GorditaLight"/>
+                <w:color w:val="4F83BE"/>
+                <w:sz w:val="18"/>
+                <w:szCs w:val="18"/>
+                <w:lang w:val="es-ES"/>
+              </w:rPr>
+            </w:pPr>
+            <w:r>
+              <w:rPr>
+                <w:rFonts w:ascii="Gordita Light" w:hAnsi="Gordita Light" w:cs="GorditaLight"/>
+                <w:sz w:val="18"/>
+                <w:szCs w:val="18"/>
+                <w:lang w:val="es-ES"/>
+              </w:rPr>
+              <w:t>[TEXT</w:t>
+            </w:r>
+            <w:r>
+              <w:rPr>
+                <w:rFonts w:ascii="Gordita Light" w:hAnsi="Gordita Light" w:cs="GorditaLight"/>
+                <w:sz w:val="18"/>
+                <w:szCs w:val="18"/>
+                <w:lang w:val="es-ES"/>
+              </w:rPr>
+              <w:t>12</w:t>
+            </w:r>
+            <w:r>
+              <w:rPr>
+                <w:rFonts w:ascii="Gordita Light" w:hAnsi="Gordita Light" w:cs="GorditaLight"/>
+                <w:sz w:val="18"/>
+                <w:szCs w:val="18"/>
+                <w:lang w:val="es-ES"/>
+              </w:rPr>
+              <w:t>]</w:t>
+            </w:r>
+          </w:p>
+        </w:tc>
+      </w:tr>
+      <w:tr>
+        <w:trPr>
+          <w:trHeight w:val="414"/>
+        </w:trPr>
+        <w:tc>
+          <w:tcPr>
+            <w:tcW w:w="4248" w:type="dxa"/>
+          </w:tcPr>
+          <w:p>
+            <w:pPr>
+              <w:rPr>
+                <w:rFonts w:ascii="Gordita Light" w:hAnsi="Gordita Light" w:cs="GorditaLight"/>
+                <w:color w:val="4F83BE"/>
+                <w:sz w:val="18"/>
+                <w:szCs w:val="18"/>
+                <w:lang w:val="es-ES"/>
+              </w:rPr>
+            </w:pPr>
+            <w:r>
+              <w:rPr>
+                <w:rFonts w:ascii="Gordita Light" w:hAnsi="Gordita Light" w:cs="GorditaLight"/>
+                <w:color w:val="4F83BE"/>
+                <w:sz w:val="18"/>
+                <w:szCs w:val="18"/>
+                <w:lang w:val="es-ES"/>
+              </w:rPr>
+              <w:t>Aplicación:</w:t>
+            </w:r>
+          </w:p>
+          <w:p>
+            <w:pPr>
+              <w:rPr>
+                <w:rFonts w:ascii="Gordita Light" w:hAnsi="Gordita Light" w:cs="GorditaLight"/>
+                <w:color w:val="4F83BE"/>
+                <w:sz w:val="18"/>
+                <w:szCs w:val="18"/>
+                <w:lang w:val="es-ES"/>
+              </w:rPr>
+            </w:pPr>
             <w:r>
               <w:rPr>
                 <w:rFonts w:ascii="Gordita Light" w:hAnsi="Gordita Light" w:cs="GorditaLight"/>
@@ -1307,7 +1450,7 @@
                   </w14:solidFill>
                 </w14:textFill>
               </w:rPr>
-              <w:t xml:space="preserve"> the tested model</w:t>
+              <w:t>Application</w:t>
             </w:r>
           </w:p>
         </w:tc>
@@ -1319,44 +1462,27 @@
             <w:pPr>
               <w:rPr>
                 <w:rFonts w:ascii="Gordita Light" w:hAnsi="Gordita Light" w:cs="GorditaLight"/>
-                <w:sz w:val="18"/>
-                <w:szCs w:val="18"/>
-                <w:lang w:val="es-ES"/>
-              </w:rPr>
-            </w:pPr>
-            <w:r>
-              <w:rPr>
-                <w:rFonts w:ascii="Gordita Light" w:hAnsi="Gordita Light" w:cs="GorditaLight"/>
-                <w:sz w:val="18"/>
-                <w:szCs w:val="18"/>
-                <w:lang w:val="es-ES"/>
-              </w:rPr>
-              <w:t>[TEXT</w:t>
-            </w:r>
-            <w:r>
-              <w:rPr>
-                <w:rFonts w:ascii="Gordita Light" w:hAnsi="Gordita Light" w:cs="GorditaLight"/>
-                <w:sz w:val="18"/>
-                <w:szCs w:val="18"/>
-                <w:lang w:val="es-ES"/>
-              </w:rPr>
-              <w:t>6</w:t>
-            </w:r>
-            <w:r>
-              <w:rPr>
-                <w:rFonts w:ascii="Gordita Light" w:hAnsi="Gordita Light" w:cs="GorditaLight"/>
-                <w:sz w:val="18"/>
-                <w:szCs w:val="18"/>
-                <w:lang w:val="es-ES"/>
-              </w:rPr>
-              <w:t>]</w:t>
+                <w:color w:val="4F83BE"/>
+                <w:sz w:val="18"/>
+                <w:szCs w:val="18"/>
+                <w:lang w:val="es-ES"/>
+              </w:rPr>
+            </w:pPr>
+            <w:r>
+              <w:rPr>
+                <w:rFonts w:ascii="Gordita Light" w:hAnsi="Gordita Light" w:cs="GorditaLight"/>
+                <w:sz w:val="18"/>
+                <w:szCs w:val="18"/>
+                <w:lang w:val="es-ES"/>
+              </w:rPr>
+              <w:t>[TEXT7]</w:t>
             </w:r>
           </w:p>
         </w:tc>
       </w:tr>
       <w:tr>
         <w:trPr>
-          <w:trHeight w:val="465"/>
+          <w:trHeight w:val="421"/>
         </w:trPr>
         <w:tc>
           <w:tcPr>
@@ -1380,7 +1506,7 @@
                 <w:szCs w:val="18"/>
                 <w:lang w:val="es-ES"/>
               </w:rPr>
-              <w:t>Familia:</w:t>
+              <w:t>Fuente de luz:</w:t>
             </w:r>
           </w:p>
           <w:p>
@@ -1401,6 +1527,7 @@
                 <w:color w:val="4F83BE"/>
                 <w:sz w:val="18"/>
                 <w:szCs w:val="18"/>
+                <w:lang w:val="es-ES"/>
                 <w14:textFill>
                   <w14:solidFill>
                     <w14:srgbClr w14:val="4F83BE">
@@ -1412,7 +1539,7 @@
                   </w14:solidFill>
                 </w14:textFill>
               </w:rPr>
-              <w:t>Family</w:t>
+              <w:t>Light source</w:t>
             </w:r>
           </w:p>
         </w:tc>
@@ -1437,113 +1564,7 @@
                 <w:szCs w:val="18"/>
                 <w:lang w:val="es-ES"/>
               </w:rPr>
-              <w:t>[TEXT</w:t>
-            </w:r>
-            <w:r>
-              <w:rPr>
-                <w:rFonts w:ascii="Gordita Light" w:hAnsi="Gordita Light" w:cs="GorditaLight"/>
-                <w:sz w:val="18"/>
-                <w:szCs w:val="18"/>
-                <w:lang w:val="es-ES"/>
-              </w:rPr>
-              <w:t>12</w:t>
-            </w:r>
-            <w:r>
-              <w:rPr>
-                <w:rFonts w:ascii="Gordita Light" w:hAnsi="Gordita Light" w:cs="GorditaLight"/>
-                <w:sz w:val="18"/>
-                <w:szCs w:val="18"/>
-                <w:lang w:val="es-ES"/>
-              </w:rPr>
-              <w:t>]</w:t>
-            </w:r>
-          </w:p>
-        </w:tc>
-      </w:tr>
-      <w:tr>
-        <w:trPr>
-          <w:trHeight w:val="414"/>
-        </w:trPr>
-        <w:tc>
-          <w:tcPr>
-            <w:tcW w:w="4248" w:type="dxa"/>
-          </w:tcPr>
-          <w:p>
-            <w:pPr>
-              <w:rPr>
-                <w:rFonts w:ascii="Gordita Light" w:hAnsi="Gordita Light" w:cs="GorditaLight"/>
-                <w:color w:val="4F83BE"/>
-                <w:sz w:val="18"/>
-                <w:szCs w:val="18"/>
-                <w:lang w:val="es-ES"/>
-              </w:rPr>
-            </w:pPr>
-            <w:r>
-              <w:rPr>
-                <w:rFonts w:ascii="Gordita Light" w:hAnsi="Gordita Light" w:cs="GorditaLight"/>
-                <w:color w:val="4F83BE"/>
-                <w:sz w:val="18"/>
-                <w:szCs w:val="18"/>
-                <w:lang w:val="es-ES"/>
-              </w:rPr>
-              <w:t>Aplicación:</w:t>
-            </w:r>
-          </w:p>
-          <w:p>
-            <w:pPr>
-              <w:rPr>
-                <w:rFonts w:ascii="Gordita Light" w:hAnsi="Gordita Light" w:cs="GorditaLight"/>
-                <w:color w:val="4F83BE"/>
-                <w:sz w:val="18"/>
-                <w:szCs w:val="18"/>
-                <w:lang w:val="es-ES"/>
-              </w:rPr>
-            </w:pPr>
-            <w:r>
-              <w:rPr>
-                <w:rFonts w:ascii="Gordita Light" w:hAnsi="Gordita Light" w:cs="GorditaLight"/>
-                <w:i/>
-                <w:iCs/>
-                <w:color w:val="4F83BE"/>
-                <w:sz w:val="18"/>
-                <w:szCs w:val="18"/>
-                <w14:textFill>
-                  <w14:solidFill>
-                    <w14:srgbClr w14:val="4F83BE">
-                      <w14:tint w14:val="66000"/>
-                      <w14:satMod w14:val="160000"/>
-                      <w14:tint w14:val="66000"/>
-                      <w14:satMod w14:val="160000"/>
-                    </w14:srgbClr>
-                  </w14:solidFill>
-                </w14:textFill>
-              </w:rPr>
-              <w:t>Application</w:t>
-            </w:r>
-          </w:p>
-        </w:tc>
-        <w:tc>
-          <w:tcPr>
-            <w:tcW w:w="4382" w:type="dxa"/>
-          </w:tcPr>
-          <w:p>
-            <w:pPr>
-              <w:rPr>
-                <w:rFonts w:ascii="Gordita Light" w:hAnsi="Gordita Light" w:cs="GorditaLight"/>
-                <w:color w:val="4F83BE"/>
-                <w:sz w:val="18"/>
-                <w:szCs w:val="18"/>
-                <w:lang w:val="es-ES"/>
-              </w:rPr>
-            </w:pPr>
-            <w:r>
-              <w:rPr>
-                <w:rFonts w:ascii="Gordita Light" w:hAnsi="Gordita Light" w:cs="GorditaLight"/>
-                <w:sz w:val="18"/>
-                <w:szCs w:val="18"/>
-                <w:lang w:val="es-ES"/>
-              </w:rPr>
-              <w:t>[TEXT7]</w:t>
+              <w:t>[TEXT8]</w:t>
             </w:r>
           </w:p>
         </w:tc>
@@ -1574,142 +1595,7 @@
                 <w:szCs w:val="18"/>
                 <w:lang w:val="es-ES"/>
               </w:rPr>
-              <w:t>Fuente de luz:</w:t>
-            </w:r>
-          </w:p>
-          <w:p>
-            <w:pPr>
-              <w:rPr>
-                <w:rFonts w:ascii="Gordita Light" w:hAnsi="Gordita Light" w:cs="GorditaLight"/>
-                <w:color w:val="4F83BE"/>
-                <w:sz w:val="18"/>
-                <w:szCs w:val="18"/>
-                <w:lang w:val="es-ES"/>
-              </w:rPr>
-            </w:pPr>
-            <w:r>
-              <w:rPr>
-                <w:rFonts w:ascii="Gordita Light" w:hAnsi="Gordita Light" w:cs="GorditaLight"/>
-                <w:i/>
-                <w:iCs/>
-                <w:color w:val="4F83BE"/>
-                <w:sz w:val="18"/>
-                <w:szCs w:val="18"/>
-                <w:lang w:val="es-ES"/>
-                <w14:textFill>
-                  <w14:solidFill>
-                    <w14:srgbClr w14:val="4F83BE">
-                      <w14:tint w14:val="66000"/>
-                      <w14:satMod w14:val="160000"/>
-                      <w14:tint w14:val="66000"/>
-                      <w14:satMod w14:val="160000"/>
-                    </w14:srgbClr>
-                  </w14:solidFill>
-                </w14:textFill>
-              </w:rPr>
-              <w:t xml:space="preserve">Light </w:t>
-            </w:r>
-            <w:proofErr w:type="spellStart"/>
-            <w:r>
-              <w:rPr>
-                <w:rFonts w:ascii="Gordita Light" w:hAnsi="Gordita Light" w:cs="GorditaLight"/>
-                <w:i/>
-                <w:iCs/>
-                <w:color w:val="4F83BE"/>
-                <w:sz w:val="18"/>
-                <w:szCs w:val="18"/>
-                <w:lang w:val="es-ES"/>
-                <w14:textFill>
-                  <w14:solidFill>
-                    <w14:srgbClr w14:val="4F83BE">
-                      <w14:tint w14:val="66000"/>
-                      <w14:satMod w14:val="160000"/>
-                      <w14:tint w14:val="66000"/>
-                      <w14:satMod w14:val="160000"/>
-                    </w14:srgbClr>
-                  </w14:solidFill>
-                </w14:textFill>
-              </w:rPr>
-              <w:t>source</w:t>
-            </w:r>
-            <w:proofErr w:type="spellEnd"/>
-          </w:p>
-        </w:tc>
-        <w:tc>
-          <w:tcPr>
-            <w:tcW w:w="4382" w:type="dxa"/>
-          </w:tcPr>
-          <w:p>
-            <w:pPr>
-              <w:rPr>
-                <w:rFonts w:ascii="Gordita Light" w:hAnsi="Gordita Light" w:cs="GorditaLight"/>
-                <w:color w:val="4F83BE"/>
-                <w:sz w:val="18"/>
-                <w:szCs w:val="18"/>
-                <w:lang w:val="es-ES"/>
-              </w:rPr>
-            </w:pPr>
-            <w:r>
-              <w:rPr>
-                <w:rFonts w:ascii="Gordita Light" w:hAnsi="Gordita Light" w:cs="GorditaLight"/>
-                <w:sz w:val="18"/>
-                <w:szCs w:val="18"/>
-                <w:lang w:val="es-ES"/>
-              </w:rPr>
-              <w:t>[TEXT8]</w:t>
-            </w:r>
-          </w:p>
-        </w:tc>
-      </w:tr>
-      <w:tr>
-        <w:trPr>
-          <w:trHeight w:val="421"/>
-        </w:trPr>
-        <w:tc>
-          <w:tcPr>
-            <w:tcW w:w="4248" w:type="dxa"/>
-          </w:tcPr>
-          <w:p>
-            <w:pPr>
-              <w:rPr>
-                <w:rFonts w:ascii="Gordita Light" w:hAnsi="Gordita Light" w:cs="GorditaLight"/>
-                <w:color w:val="4F83BE"/>
-                <w:sz w:val="18"/>
-                <w:szCs w:val="18"/>
-                <w:lang w:val="es-ES"/>
-              </w:rPr>
-            </w:pPr>
-            <w:r>
-              <w:rPr>
-                <w:rFonts w:ascii="Gordita Light" w:hAnsi="Gordita Light" w:cs="GorditaLight"/>
-                <w:color w:val="4F83BE"/>
-                <w:sz w:val="18"/>
-                <w:szCs w:val="18"/>
-                <w:lang w:val="es-ES"/>
-              </w:rPr>
-              <w:t>Fuente de alimentación (</w:t>
-            </w:r>
-            <w:proofErr w:type="gramStart"/>
-            <w:r>
-              <w:rPr>
-                <w:rFonts w:ascii="Gordita Light" w:hAnsi="Gordita Light" w:cs="GorditaLight"/>
-                <w:color w:val="4F83BE"/>
-                <w:sz w:val="18"/>
-                <w:szCs w:val="18"/>
-                <w:lang w:val="es-ES"/>
-              </w:rPr>
-              <w:t>driver</w:t>
-            </w:r>
-            <w:proofErr w:type="gramEnd"/>
-            <w:r>
-              <w:rPr>
-                <w:rFonts w:ascii="Gordita Light" w:hAnsi="Gordita Light" w:cs="GorditaLight"/>
-                <w:color w:val="4F83BE"/>
-                <w:sz w:val="18"/>
-                <w:szCs w:val="18"/>
-                <w:lang w:val="es-ES"/>
-              </w:rPr>
-              <w:t>):</w:t>
+              <w:t>Fuente de alimentación (driver):</w:t>
             </w:r>
           </w:p>
           <w:p>
@@ -2653,7 +2539,6 @@
                 <w:lang w:val="es-ES"/>
               </w:rPr>
             </w:pPr>
-            <w:proofErr w:type="spellStart"/>
             <w:r>
               <w:rPr>
                 <w:rFonts w:ascii="Gordita Light" w:hAnsi="Gordita Light" w:cs="GorditaLight"/>
@@ -2674,30 +2559,7 @@
                   </w14:solidFill>
                 </w14:textFill>
               </w:rPr>
-              <w:t>Calibration</w:t>
-            </w:r>
-            <w:proofErr w:type="spellEnd"/>
-            <w:r>
-              <w:rPr>
-                <w:rFonts w:ascii="Gordita Light" w:hAnsi="Gordita Light" w:cs="GorditaLight"/>
-                <w:i/>
-                <w:iCs/>
-                <w:color w:val="4F83BE"/>
-                <w:sz w:val="18"/>
-                <w:szCs w:val="18"/>
-                <w:lang w:val="es-ES"/>
-                <w14:textFill>
-                  <w14:solidFill>
-                    <w14:srgbClr w14:val="4F83BE">
-                      <w14:tint w14:val="66000"/>
-                      <w14:satMod w14:val="160000"/>
-                      <w14:tint w14:val="66000"/>
-                      <w14:satMod w14:val="160000"/>
-                    </w14:srgbClr>
-                  </w14:solidFill>
-                </w14:textFill>
-              </w:rPr>
-              <w:t xml:space="preserve"> date</w:t>
+              <w:t>Calibration date</w:t>
             </w:r>
           </w:p>
         </w:tc>
@@ -4799,27 +4661,7 @@
                 <w:szCs w:val="18"/>
                 <w:lang w:val="es-ES"/>
               </w:rPr>
-              <w:t xml:space="preserve">2. Verificar que se cumplen las condiciones ambientales requeridas para el inicio del ensayo (25 ± 5 </w:t>
-            </w:r>
-            <w:proofErr w:type="spellStart"/>
-            <w:r>
-              <w:rPr>
-                <w:rFonts w:ascii="Gordita Light" w:hAnsi="Gordita Light" w:cs="GorditaLight"/>
-                <w:sz w:val="18"/>
-                <w:szCs w:val="18"/>
-                <w:lang w:val="es-ES"/>
-              </w:rPr>
-              <w:t>ºC</w:t>
-            </w:r>
-            <w:proofErr w:type="spellEnd"/>
-            <w:r>
-              <w:rPr>
-                <w:rFonts w:ascii="Gordita Light" w:hAnsi="Gordita Light" w:cs="GorditaLight"/>
-                <w:sz w:val="18"/>
-                <w:szCs w:val="18"/>
-                <w:lang w:val="es-ES"/>
-              </w:rPr>
-              <w:t>, HR &lt; 75%).</w:t>
+              <w:t>2. Verificar que se cumplen las condiciones ambientales requeridas para el inicio del ensayo (25 ± 5 ºC, HR &lt; 75%).</w:t>
             </w:r>
           </w:p>
           <w:p>
@@ -4839,27 +4681,7 @@
                 <w:szCs w:val="18"/>
                 <w:lang w:val="es-ES"/>
               </w:rPr>
-              <w:t xml:space="preserve">3. Iniciar el registro de datos con el software AMR </w:t>
-            </w:r>
-            <w:proofErr w:type="spellStart"/>
-            <w:r>
-              <w:rPr>
-                <w:rFonts w:ascii="Gordita Light" w:hAnsi="Gordita Light" w:cs="GorditaLight"/>
-                <w:sz w:val="18"/>
-                <w:szCs w:val="18"/>
-                <w:lang w:val="es-ES"/>
-              </w:rPr>
-              <w:t>WinControl</w:t>
-            </w:r>
-            <w:proofErr w:type="spellEnd"/>
-            <w:r>
-              <w:rPr>
-                <w:rFonts w:ascii="Gordita Light" w:hAnsi="Gordita Light" w:cs="GorditaLight"/>
-                <w:sz w:val="18"/>
-                <w:szCs w:val="18"/>
-                <w:lang w:val="es-ES"/>
-              </w:rPr>
-              <w:t>.</w:t>
+              <w:t>3. Iniciar el registro de datos con el software AMR WinControl.</w:t>
             </w:r>
           </w:p>
           <w:p>
@@ -4899,27 +4721,7 @@
                 <w:szCs w:val="18"/>
                 <w:lang w:val="es-ES"/>
               </w:rPr>
-              <w:t xml:space="preserve">5. Registrar las temperaturas medidas por todas las sondas hasta que todas ellas se estabilicen según los requisitos de la norma (diferencia &lt;1 </w:t>
-            </w:r>
-            <w:proofErr w:type="spellStart"/>
-            <w:r>
-              <w:rPr>
-                <w:rFonts w:ascii="Gordita Light" w:hAnsi="Gordita Light" w:cs="GorditaLight"/>
-                <w:sz w:val="18"/>
-                <w:szCs w:val="18"/>
-                <w:lang w:val="es-ES"/>
-              </w:rPr>
-              <w:t>ºC</w:t>
-            </w:r>
-            <w:proofErr w:type="spellEnd"/>
-            <w:r>
-              <w:rPr>
-                <w:rFonts w:ascii="Gordita Light" w:hAnsi="Gordita Light" w:cs="GorditaLight"/>
-                <w:sz w:val="18"/>
-                <w:szCs w:val="18"/>
-                <w:lang w:val="es-ES"/>
-              </w:rPr>
-              <w:t xml:space="preserve"> durante 1 hora).</w:t>
+              <w:t>5. Registrar las temperaturas medidas por todas las sondas hasta que todas ellas se estabilicen según los requisitos de la norma (diferencia &lt;1 ºC durante 1 hora).</w:t>
             </w:r>
           </w:p>
           <w:p>
@@ -6885,21 +6687,8 @@
           <w:szCs w:val="18"/>
           <w:lang w:val="es-ES"/>
         </w:rPr>
-        <w:t xml:space="preserve">Periodo de </w:t>
+        <w:t>Periodo de estabilización :</w:t>
       </w:r>
-      <w:proofErr w:type="gramStart"/>
-      <w:r>
-        <w:rPr>
-          <w:rFonts w:ascii="Gordita Light" w:hAnsi="Gordita Light" w:cs="GorditaLight"/>
-          <w:b/>
-          <w:bCs/>
-          <w:sz w:val="18"/>
-          <w:szCs w:val="18"/>
-          <w:lang w:val="es-ES"/>
-        </w:rPr>
-        <w:t>estabilización :</w:t>
-      </w:r>
-      <w:proofErr w:type="gramEnd"/>
       <w:r>
         <w:rPr>
           <w:rFonts w:ascii="Gordita Light" w:hAnsi="Gordita Light" w:cs="GorditaLight"/>
@@ -6949,29 +6738,7 @@
           <w:szCs w:val="18"/>
           <w:lang w:val="es-ES"/>
         </w:rPr>
-        <w:t xml:space="preserve">El gráfico se ha seccionado para mostrar el comportamiento térmico del arranque con un objetivo meramente </w:t>
-      </w:r>
-      <w:proofErr w:type="spellStart"/>
-      <w:proofErr w:type="gramStart"/>
-      <w:r>
-        <w:rPr>
-          <w:rFonts w:ascii="Gordita Light" w:hAnsi="Gordita Light" w:cs="GorditaLight"/>
-          <w:sz w:val="18"/>
-          <w:szCs w:val="18"/>
-          <w:lang w:val="es-ES"/>
-        </w:rPr>
-        <w:t>informativo.Para</w:t>
-      </w:r>
-      <w:proofErr w:type="spellEnd"/>
-      <w:proofErr w:type="gramEnd"/>
-      <w:r>
-        <w:rPr>
-          <w:rFonts w:ascii="Gordita Light" w:hAnsi="Gordita Light" w:cs="GorditaLight"/>
-          <w:sz w:val="18"/>
-          <w:szCs w:val="18"/>
-          <w:lang w:val="es-ES"/>
-        </w:rPr>
-        <w:t xml:space="preserve"> la verificación del cumplimiento normativo, debe tomarse únicamente la segunda parte donde las temperaturas ya están estabilizadas.</w:t>
+        <w:t>El gráfico se ha seccionado para mostrar el comportamiento térmico del arranque con un objetivo meramente informativo.Para la verificación del cumplimiento normativo, debe tomarse únicamente la segunda parte donde las temperaturas ya están estabilizadas.</w:t>
       </w:r>
     </w:p>
     <w:p>
@@ -7425,7 +7192,6 @@
                 <w:lang w:val="es-ES"/>
               </w:rPr>
             </w:pPr>
-            <w:proofErr w:type="spellStart"/>
             <w:r>
               <w:rPr>
                 <w:rFonts w:ascii="Gordita Light" w:hAnsi="Gordita Light" w:cs="GorditaLight"/>
@@ -7446,9 +7212,8 @@
                   </w14:solidFill>
                 </w14:textFill>
               </w:rPr>
-              <w:t>Minimum</w:t>
-            </w:r>
-            <w:proofErr w:type="spellEnd"/>
+              <w:t>Minimum Stabilization Value</w:t>
+            </w:r>
             <w:r>
               <w:rPr>
                 <w:rFonts w:ascii="Gordita Light" w:hAnsi="Gordita Light" w:cs="GorditaLight"/>
@@ -7471,7 +7236,48 @@
               </w:rPr>
               <w:t xml:space="preserve"> </w:t>
             </w:r>
-            <w:proofErr w:type="spellStart"/>
+          </w:p>
+        </w:tc>
+        <w:tc>
+          <w:tcPr>
+            <w:tcW w:w="2069" w:type="dxa"/>
+          </w:tcPr>
+          <w:p>
+            <w:pPr>
+              <w:jc w:val="center"/>
+              <w:rPr>
+                <w:rFonts w:ascii="Gordita Light" w:hAnsi="Gordita Light" w:cs="GorditaLight"/>
+                <w:b/>
+                <w:bCs/>
+                <w:color w:val="4F83BE"/>
+                <w:sz w:val="18"/>
+                <w:szCs w:val="18"/>
+                <w:lang w:val="es-ES"/>
+              </w:rPr>
+            </w:pPr>
+            <w:r>
+              <w:rPr>
+                <w:rFonts w:ascii="Gordita Light" w:hAnsi="Gordita Light" w:cs="GorditaLight"/>
+                <w:b/>
+                <w:bCs/>
+                <w:color w:val="4F83BE"/>
+                <w:sz w:val="18"/>
+                <w:szCs w:val="18"/>
+                <w:lang w:val="es-ES"/>
+              </w:rPr>
+              <w:t>Valor Máximo de estabilización</w:t>
+            </w:r>
+          </w:p>
+          <w:p>
+            <w:pPr>
+              <w:jc w:val="center"/>
+              <w:rPr>
+                <w:rFonts w:ascii="Gordita Light" w:hAnsi="Gordita Light" w:cs="GorditaLight"/>
+                <w:sz w:val="18"/>
+                <w:szCs w:val="18"/>
+                <w:lang w:val="es-ES"/>
+              </w:rPr>
+            </w:pPr>
             <w:r>
               <w:rPr>
                 <w:rFonts w:ascii="Gordita Light" w:hAnsi="Gordita Light" w:cs="GorditaLight"/>
@@ -7492,235 +7298,8 @@
                   </w14:solidFill>
                 </w14:textFill>
               </w:rPr>
-              <w:t>Stabilization</w:t>
-            </w:r>
-            <w:proofErr w:type="spellEnd"/>
-            <w:r>
-              <w:rPr>
-                <w:rFonts w:ascii="Gordita Light" w:hAnsi="Gordita Light" w:cs="GorditaLight"/>
-                <w:i/>
-                <w:iCs/>
-                <w:color w:val="4F83BE"/>
-                <w:sz w:val="18"/>
-                <w:szCs w:val="18"/>
-                <w:lang w:val="es-ES"/>
-                <w14:textFill>
-                  <w14:solidFill>
-                    <w14:srgbClr w14:val="4F83BE">
-                      <w14:tint w14:val="66000"/>
-                      <w14:satMod w14:val="160000"/>
-                      <w14:tint w14:val="66000"/>
-                      <w14:satMod w14:val="160000"/>
-                    </w14:srgbClr>
-                  </w14:solidFill>
-                </w14:textFill>
-              </w:rPr>
-              <w:t xml:space="preserve"> </w:t>
-            </w:r>
-            <w:proofErr w:type="spellStart"/>
-            <w:r>
-              <w:rPr>
-                <w:rFonts w:ascii="Gordita Light" w:hAnsi="Gordita Light" w:cs="GorditaLight"/>
-                <w:i/>
-                <w:iCs/>
-                <w:color w:val="4F83BE"/>
-                <w:sz w:val="18"/>
-                <w:szCs w:val="18"/>
-                <w:lang w:val="es-ES"/>
-                <w14:textFill>
-                  <w14:solidFill>
-                    <w14:srgbClr w14:val="4F83BE">
-                      <w14:tint w14:val="66000"/>
-                      <w14:satMod w14:val="160000"/>
-                      <w14:tint w14:val="66000"/>
-                      <w14:satMod w14:val="160000"/>
-                    </w14:srgbClr>
-                  </w14:solidFill>
-                </w14:textFill>
-              </w:rPr>
-              <w:t>Value</w:t>
-            </w:r>
-            <w:proofErr w:type="spellEnd"/>
-            <w:r>
-              <w:rPr>
-                <w:rFonts w:ascii="Gordita Light" w:hAnsi="Gordita Light" w:cs="GorditaLight"/>
-                <w:i/>
-                <w:iCs/>
-                <w:color w:val="4F83BE"/>
-                <w:sz w:val="18"/>
-                <w:szCs w:val="18"/>
-                <w:lang w:val="es-ES"/>
-                <w14:textFill>
-                  <w14:solidFill>
-                    <w14:srgbClr w14:val="4F83BE">
-                      <w14:tint w14:val="66000"/>
-                      <w14:satMod w14:val="160000"/>
-                      <w14:tint w14:val="66000"/>
-                      <w14:satMod w14:val="160000"/>
-                    </w14:srgbClr>
-                  </w14:solidFill>
-                </w14:textFill>
-              </w:rPr>
-              <w:t xml:space="preserve"> </w:t>
-            </w:r>
-          </w:p>
-        </w:tc>
-        <w:tc>
-          <w:tcPr>
-            <w:tcW w:w="2069" w:type="dxa"/>
-          </w:tcPr>
-          <w:p>
-            <w:pPr>
-              <w:jc w:val="center"/>
-              <w:rPr>
-                <w:rFonts w:ascii="Gordita Light" w:hAnsi="Gordita Light" w:cs="GorditaLight"/>
-                <w:b/>
-                <w:bCs/>
-                <w:color w:val="4F83BE"/>
-                <w:sz w:val="18"/>
-                <w:szCs w:val="18"/>
-                <w:lang w:val="es-ES"/>
-              </w:rPr>
-            </w:pPr>
-            <w:r>
-              <w:rPr>
-                <w:rFonts w:ascii="Gordita Light" w:hAnsi="Gordita Light" w:cs="GorditaLight"/>
-                <w:b/>
-                <w:bCs/>
-                <w:color w:val="4F83BE"/>
-                <w:sz w:val="18"/>
-                <w:szCs w:val="18"/>
-                <w:lang w:val="es-ES"/>
-              </w:rPr>
-              <w:t>Valor Máximo de estabilización</w:t>
-            </w:r>
-          </w:p>
-          <w:p>
-            <w:pPr>
-              <w:jc w:val="center"/>
-              <w:rPr>
-                <w:rFonts w:ascii="Gordita Light" w:hAnsi="Gordita Light" w:cs="GorditaLight"/>
-                <w:sz w:val="18"/>
-                <w:szCs w:val="18"/>
-                <w:lang w:val="es-ES"/>
-              </w:rPr>
-            </w:pPr>
-            <w:proofErr w:type="spellStart"/>
-            <w:r>
-              <w:rPr>
-                <w:rFonts w:ascii="Gordita Light" w:hAnsi="Gordita Light" w:cs="GorditaLight"/>
-                <w:i/>
-                <w:iCs/>
-                <w:color w:val="4F83BE"/>
-                <w:sz w:val="18"/>
-                <w:szCs w:val="18"/>
-                <w:lang w:val="es-ES"/>
-                <w14:textFill>
-                  <w14:solidFill>
-                    <w14:srgbClr w14:val="4F83BE">
-                      <w14:tint w14:val="66000"/>
-                      <w14:satMod w14:val="160000"/>
-                      <w14:tint w14:val="66000"/>
-                      <w14:satMod w14:val="160000"/>
-                    </w14:srgbClr>
-                  </w14:solidFill>
-                </w14:textFill>
-              </w:rPr>
-              <w:t>Maximum</w:t>
-            </w:r>
-            <w:proofErr w:type="spellEnd"/>
-            <w:r>
-              <w:rPr>
-                <w:rFonts w:ascii="Gordita Light" w:hAnsi="Gordita Light" w:cs="GorditaLight"/>
-                <w:i/>
-                <w:iCs/>
-                <w:color w:val="4F83BE"/>
-                <w:sz w:val="18"/>
-                <w:szCs w:val="18"/>
-                <w:lang w:val="es-ES"/>
-                <w14:textFill>
-                  <w14:solidFill>
-                    <w14:srgbClr w14:val="4F83BE">
-                      <w14:tint w14:val="66000"/>
-                      <w14:satMod w14:val="160000"/>
-                      <w14:tint w14:val="66000"/>
-                      <w14:satMod w14:val="160000"/>
-                    </w14:srgbClr>
-                  </w14:solidFill>
-                </w14:textFill>
-              </w:rPr>
-              <w:t xml:space="preserve"> </w:t>
-            </w:r>
-            <w:proofErr w:type="spellStart"/>
-            <w:r>
-              <w:rPr>
-                <w:rFonts w:ascii="Gordita Light" w:hAnsi="Gordita Light" w:cs="GorditaLight"/>
-                <w:i/>
-                <w:iCs/>
-                <w:color w:val="4F83BE"/>
-                <w:sz w:val="18"/>
-                <w:szCs w:val="18"/>
-                <w:lang w:val="es-ES"/>
-                <w14:textFill>
-                  <w14:solidFill>
-                    <w14:srgbClr w14:val="4F83BE">
-                      <w14:tint w14:val="66000"/>
-                      <w14:satMod w14:val="160000"/>
-                      <w14:tint w14:val="66000"/>
-                      <w14:satMod w14:val="160000"/>
-                    </w14:srgbClr>
-                  </w14:solidFill>
-                </w14:textFill>
-              </w:rPr>
-              <w:t>Stabilization</w:t>
-            </w:r>
-            <w:proofErr w:type="spellEnd"/>
-            <w:r>
-              <w:rPr>
-                <w:rFonts w:ascii="Gordita Light" w:hAnsi="Gordita Light" w:cs="GorditaLight"/>
-                <w:i/>
-                <w:iCs/>
-                <w:color w:val="4F83BE"/>
-                <w:sz w:val="18"/>
-                <w:szCs w:val="18"/>
-                <w:lang w:val="es-ES"/>
-                <w14:textFill>
-                  <w14:solidFill>
-                    <w14:srgbClr w14:val="4F83BE">
-                      <w14:tint w14:val="66000"/>
-                      <w14:satMod w14:val="160000"/>
-                      <w14:tint w14:val="66000"/>
-                      <w14:satMod w14:val="160000"/>
-                    </w14:srgbClr>
-                  </w14:solidFill>
-                </w14:textFill>
-              </w:rPr>
-              <w:t xml:space="preserve"> </w:t>
-            </w:r>
-            <w:proofErr w:type="spellStart"/>
-            <w:r>
-              <w:rPr>
-                <w:rFonts w:ascii="Gordita Light" w:hAnsi="Gordita Light" w:cs="GorditaLight"/>
-                <w:i/>
-                <w:iCs/>
-                <w:color w:val="4F83BE"/>
-                <w:sz w:val="18"/>
-                <w:szCs w:val="18"/>
-                <w:lang w:val="es-ES"/>
-                <w14:textFill>
-                  <w14:solidFill>
-                    <w14:srgbClr w14:val="4F83BE">
-                      <w14:tint w14:val="66000"/>
-                      <w14:satMod w14:val="160000"/>
-                      <w14:tint w14:val="66000"/>
-                      <w14:satMod w14:val="160000"/>
-                    </w14:srgbClr>
-                  </w14:solidFill>
-                </w14:textFill>
-              </w:rPr>
-              <w:t>Value</w:t>
-            </w:r>
-            <w:proofErr w:type="spellEnd"/>
+              <w:t>Maximum Stabilization Value</w:t>
+            </w:r>
           </w:p>
         </w:tc>
         <w:tc>
@@ -10919,27 +10498,7 @@
           <w:szCs w:val="18"/>
           <w:lang w:val="es-ES"/>
         </w:rPr>
-        <w:t xml:space="preserve">Tras el ensayo en funcionamiento normal de la muestra, se observa que los valores obtenidos se encuentran dentro de los límites establecidos </w:t>
-      </w:r>
-      <w:proofErr w:type="gramStart"/>
-      <w:r>
-        <w:rPr>
-          <w:rFonts w:ascii="Gordita Light" w:hAnsi="Gordita Light" w:cs="GorditaLight"/>
-          <w:sz w:val="18"/>
-          <w:szCs w:val="18"/>
-          <w:lang w:val="es-ES"/>
-        </w:rPr>
-        <w:t>y</w:t>
-      </w:r>
-      <w:proofErr w:type="gramEnd"/>
-      <w:r>
-        <w:rPr>
-          <w:rFonts w:ascii="Gordita Light" w:hAnsi="Gordita Light" w:cs="GorditaLight"/>
-          <w:sz w:val="18"/>
-          <w:szCs w:val="18"/>
-          <w:lang w:val="es-ES"/>
-        </w:rPr>
-        <w:t xml:space="preserve"> por lo tanto, CUMPLEN los requisitos de la norma.</w:t>
+        <w:t>Tras el ensayo en funcionamiento normal de la muestra, se observa que los valores obtenidos se encuentran dentro de los límites establecidos y por lo tanto, CUMPLEN los requisitos de la norma.</w:t>
       </w:r>
     </w:p>
     <w:p>
@@ -12627,6 +12186,191 @@
           </w:p>
         </w:tc>
       </w:tr>
+      <w:tr>
+        <w:trPr>
+          <w:trHeight w:val="5108"/>
+        </w:trPr>
+        <w:tc>
+          <w:tcPr>
+            <w:tcW w:w="4315" w:type="dxa"/>
+          </w:tcPr>
+          <w:p>
+            <w:pPr>
+              <w:jc w:val="center"/>
+              <w:rPr>
+                <w:rFonts w:ascii="Gordita Light" w:hAnsi="Gordita Light" w:cs="GorditaLight"/>
+                <w:sz w:val="18"/>
+                <w:szCs w:val="18"/>
+              </w:rPr>
+            </w:pPr>
+            <w:r>
+              <w:rPr>
+                <w:rFonts w:ascii="Gordita Light" w:hAnsi="Gordita Light" w:cs="GorditaLight"/>
+                <w:sz w:val="18"/>
+                <w:szCs w:val="18"/>
+              </w:rPr>
+              <w:t>[TITLE</w:t>
+            </w:r>
+            <w:r>
+              <w:rPr>
+                <w:rFonts w:ascii="Gordita Light" w:hAnsi="Gordita Light" w:cs="GorditaLight"/>
+                <w:sz w:val="18"/>
+                <w:szCs w:val="18"/>
+              </w:rPr>
+              <w:t>17</w:t>
+            </w:r>
+            <w:r>
+              <w:rPr>
+                <w:rFonts w:ascii="Gordita Light" w:hAnsi="Gordita Light" w:cs="GorditaLight"/>
+                <w:sz w:val="18"/>
+                <w:szCs w:val="18"/>
+              </w:rPr>
+              <w:t>]</w:t>
+            </w:r>
+          </w:p>
+          <w:p>
+            <w:pPr>
+              <w:jc w:val="center"/>
+              <w:rPr>
+                <w:rFonts w:ascii="Gordita Light" w:hAnsi="Gordita Light" w:cs="GorditaLight"/>
+                <w:sz w:val="18"/>
+                <w:szCs w:val="18"/>
+              </w:rPr>
+            </w:pPr>
+          </w:p>
+          <w:p>
+            <w:pPr>
+              <w:jc w:val="center"/>
+              <w:rPr>
+                <w:rFonts w:ascii="Gordita Light" w:hAnsi="Gordita Light" w:cs="GorditaLight"/>
+                <w:color w:val="4F83BE"/>
+              </w:rPr>
+            </w:pPr>
+            <w:r>
+              <w:rPr>
+                <w:rFonts w:ascii="Gordita Light" w:hAnsi="Gordita Light" w:cs="GorditaLight"/>
+                <w:sz w:val="18"/>
+                <w:szCs w:val="18"/>
+              </w:rPr>
+              <w:t>[IMAGE</w:t>
+            </w:r>
+            <w:r>
+              <w:rPr>
+                <w:rFonts w:ascii="Gordita Light" w:hAnsi="Gordita Light" w:cs="GorditaLight"/>
+                <w:sz w:val="18"/>
+                <w:szCs w:val="18"/>
+              </w:rPr>
+              <w:t>17</w:t>
+            </w:r>
+            <w:r>
+              <w:rPr>
+                <w:rFonts w:ascii="Gordita Light" w:hAnsi="Gordita Light" w:cs="GorditaLight"/>
+                <w:sz w:val="18"/>
+                <w:szCs w:val="18"/>
+              </w:rPr>
+              <w:t>]</w:t>
+            </w:r>
+          </w:p>
+          <w:p>
+            <w:pPr>
+              <w:rPr>
+                <w:rFonts w:ascii="Gordita Light" w:hAnsi="Gordita Light" w:cs="GorditaLight"/>
+                <w:color w:val="4F83BE"/>
+              </w:rPr>
+            </w:pPr>
+          </w:p>
+        </w:tc>
+        <w:tc>
+          <w:tcPr>
+            <w:tcW w:w="4315" w:type="dxa"/>
+          </w:tcPr>
+          <w:p>
+            <w:pPr>
+              <w:jc w:val="center"/>
+              <w:rPr>
+                <w:rFonts w:ascii="Gordita Light" w:hAnsi="Gordita Light" w:cs="GorditaLight"/>
+                <w:sz w:val="18"/>
+                <w:szCs w:val="18"/>
+              </w:rPr>
+            </w:pPr>
+            <w:r>
+              <w:rPr>
+                <w:rFonts w:ascii="Gordita Light" w:hAnsi="Gordita Light" w:cs="GorditaLight"/>
+                <w:sz w:val="18"/>
+                <w:szCs w:val="18"/>
+              </w:rPr>
+              <w:t>[TITLE</w:t>
+            </w:r>
+            <w:r>
+              <w:rPr>
+                <w:rFonts w:ascii="Gordita Light" w:hAnsi="Gordita Light" w:cs="GorditaLight"/>
+                <w:sz w:val="18"/>
+                <w:szCs w:val="18"/>
+              </w:rPr>
+              <w:t>18</w:t>
+            </w:r>
+            <w:r>
+              <w:rPr>
+                <w:rFonts w:ascii="Gordita Light" w:hAnsi="Gordita Light" w:cs="GorditaLight"/>
+                <w:sz w:val="18"/>
+                <w:szCs w:val="18"/>
+              </w:rPr>
+              <w:t>]</w:t>
+            </w:r>
+          </w:p>
+          <w:p>
+            <w:pPr>
+              <w:jc w:val="center"/>
+              <w:rPr>
+                <w:rFonts w:ascii="Gordita Light" w:hAnsi="Gordita Light" w:cs="GorditaLight"/>
+                <w:sz w:val="18"/>
+                <w:szCs w:val="18"/>
+              </w:rPr>
+            </w:pPr>
+          </w:p>
+          <w:p>
+            <w:pPr>
+              <w:jc w:val="center"/>
+              <w:rPr>
+                <w:rFonts w:ascii="Gordita Light" w:hAnsi="Gordita Light" w:cs="GorditaLight"/>
+                <w:color w:val="4F83BE"/>
+              </w:rPr>
+            </w:pPr>
+            <w:r>
+              <w:rPr>
+                <w:rFonts w:ascii="Gordita Light" w:hAnsi="Gordita Light" w:cs="GorditaLight"/>
+                <w:sz w:val="18"/>
+                <w:szCs w:val="18"/>
+              </w:rPr>
+              <w:t>[IMAGE</w:t>
+            </w:r>
+            <w:r>
+              <w:rPr>
+                <w:rFonts w:ascii="Gordita Light" w:hAnsi="Gordita Light" w:cs="GorditaLight"/>
+                <w:sz w:val="18"/>
+                <w:szCs w:val="18"/>
+              </w:rPr>
+              <w:t>18</w:t>
+            </w:r>
+            <w:r>
+              <w:rPr>
+                <w:rFonts w:ascii="Gordita Light" w:hAnsi="Gordita Light" w:cs="GorditaLight"/>
+                <w:sz w:val="18"/>
+                <w:szCs w:val="18"/>
+              </w:rPr>
+              <w:t>]</w:t>
+            </w:r>
+          </w:p>
+          <w:p>
+            <w:pPr>
+              <w:rPr>
+                <w:rFonts w:ascii="Gordita Light" w:hAnsi="Gordita Light" w:cs="GorditaLight"/>
+                <w:color w:val="4F83BE"/>
+              </w:rPr>
+            </w:pPr>
+          </w:p>
+        </w:tc>
+      </w:tr>
     </w:tbl>
     <w:p>
       <w:pPr>
@@ -12639,6 +12383,399 @@
         </w:rPr>
       </w:pPr>
     </w:p>
+    <w:p/>
+    <w:p/>
+    <w:tbl>
+      <w:tblPr>
+        <w:tblStyle w:val="TableGrid"/>
+        <w:tblW w:w="0" w:type="auto"/>
+        <w:tblBorders>
+          <w:top w:val="none" w:sz="0" w:space="0" w:color="auto"/>
+          <w:left w:val="none" w:sz="0" w:space="0" w:color="auto"/>
+          <w:bottom w:val="none" w:sz="0" w:space="0" w:color="auto"/>
+          <w:right w:val="none" w:sz="0" w:space="0" w:color="auto"/>
+          <w:insideH w:val="none" w:sz="0" w:space="0" w:color="auto"/>
+          <w:insideV w:val="none" w:sz="0" w:space="0" w:color="auto"/>
+        </w:tblBorders>
+        <w:tblLook w:val="04A0" w:firstRow="1" w:lastRow="0" w:firstColumn="1" w:lastColumn="0" w:noHBand="0" w:noVBand="1"/>
+      </w:tblPr>
+      <w:tblGrid>
+        <w:gridCol w:w="4315"/>
+        <w:gridCol w:w="4315"/>
+      </w:tblGrid>
+      <w:tr>
+        <w:trPr>
+          <w:trHeight w:val="5108"/>
+        </w:trPr>
+        <w:tc>
+          <w:tcPr>
+            <w:tcW w:w="4315" w:type="dxa"/>
+          </w:tcPr>
+          <w:p>
+            <w:pPr>
+              <w:jc w:val="center"/>
+              <w:rPr>
+                <w:rFonts w:ascii="Gordita Light" w:hAnsi="Gordita Light" w:cs="GorditaLight"/>
+                <w:sz w:val="18"/>
+                <w:szCs w:val="18"/>
+              </w:rPr>
+            </w:pPr>
+            <w:r>
+              <w:rPr>
+                <w:rFonts w:ascii="Gordita Light" w:hAnsi="Gordita Light" w:cs="GorditaLight"/>
+                <w:sz w:val="18"/>
+                <w:szCs w:val="18"/>
+              </w:rPr>
+              <w:lastRenderedPageBreak/>
+              <w:t>[TITLE</w:t>
+            </w:r>
+            <w:r>
+              <w:rPr>
+                <w:rFonts w:ascii="Gordita Light" w:hAnsi="Gordita Light" w:cs="GorditaLight"/>
+                <w:sz w:val="18"/>
+                <w:szCs w:val="18"/>
+              </w:rPr>
+              <w:t>19</w:t>
+            </w:r>
+            <w:r>
+              <w:rPr>
+                <w:rFonts w:ascii="Gordita Light" w:hAnsi="Gordita Light" w:cs="GorditaLight"/>
+                <w:sz w:val="18"/>
+                <w:szCs w:val="18"/>
+              </w:rPr>
+              <w:t>]</w:t>
+            </w:r>
+          </w:p>
+          <w:p>
+            <w:pPr>
+              <w:jc w:val="center"/>
+              <w:rPr>
+                <w:rFonts w:ascii="Gordita Light" w:hAnsi="Gordita Light" w:cs="GorditaLight"/>
+                <w:sz w:val="18"/>
+                <w:szCs w:val="18"/>
+              </w:rPr>
+            </w:pPr>
+          </w:p>
+          <w:p>
+            <w:pPr>
+              <w:jc w:val="center"/>
+              <w:rPr>
+                <w:rFonts w:ascii="Gordita Light" w:hAnsi="Gordita Light" w:cs="GorditaLight"/>
+                <w:color w:val="4F83BE"/>
+              </w:rPr>
+            </w:pPr>
+            <w:r>
+              <w:rPr>
+                <w:rFonts w:ascii="Gordita Light" w:hAnsi="Gordita Light" w:cs="GorditaLight"/>
+                <w:sz w:val="18"/>
+                <w:szCs w:val="18"/>
+              </w:rPr>
+              <w:t>[IMAGE</w:t>
+            </w:r>
+            <w:r>
+              <w:rPr>
+                <w:rFonts w:ascii="Gordita Light" w:hAnsi="Gordita Light" w:cs="GorditaLight"/>
+                <w:sz w:val="18"/>
+                <w:szCs w:val="18"/>
+              </w:rPr>
+              <w:t>19</w:t>
+            </w:r>
+            <w:r>
+              <w:rPr>
+                <w:rFonts w:ascii="Gordita Light" w:hAnsi="Gordita Light" w:cs="GorditaLight"/>
+                <w:sz w:val="18"/>
+                <w:szCs w:val="18"/>
+              </w:rPr>
+              <w:t>]</w:t>
+            </w:r>
+          </w:p>
+          <w:p>
+            <w:pPr>
+              <w:rPr>
+                <w:rFonts w:ascii="Gordita Light" w:hAnsi="Gordita Light" w:cs="GorditaLight"/>
+                <w:color w:val="4F83BE"/>
+              </w:rPr>
+            </w:pPr>
+          </w:p>
+        </w:tc>
+        <w:tc>
+          <w:tcPr>
+            <w:tcW w:w="4315" w:type="dxa"/>
+          </w:tcPr>
+          <w:p>
+            <w:pPr>
+              <w:jc w:val="center"/>
+              <w:rPr>
+                <w:rFonts w:ascii="Gordita Light" w:hAnsi="Gordita Light" w:cs="GorditaLight"/>
+                <w:sz w:val="18"/>
+                <w:szCs w:val="18"/>
+              </w:rPr>
+            </w:pPr>
+            <w:r>
+              <w:rPr>
+                <w:rFonts w:ascii="Gordita Light" w:hAnsi="Gordita Light" w:cs="GorditaLight"/>
+                <w:sz w:val="18"/>
+                <w:szCs w:val="18"/>
+              </w:rPr>
+              <w:t>[TITLE</w:t>
+            </w:r>
+            <w:r>
+              <w:rPr>
+                <w:rFonts w:ascii="Gordita Light" w:hAnsi="Gordita Light" w:cs="GorditaLight"/>
+                <w:sz w:val="18"/>
+                <w:szCs w:val="18"/>
+              </w:rPr>
+              <w:t>20</w:t>
+            </w:r>
+            <w:r>
+              <w:rPr>
+                <w:rFonts w:ascii="Gordita Light" w:hAnsi="Gordita Light" w:cs="GorditaLight"/>
+                <w:sz w:val="18"/>
+                <w:szCs w:val="18"/>
+              </w:rPr>
+              <w:t>]</w:t>
+            </w:r>
+          </w:p>
+          <w:p>
+            <w:pPr>
+              <w:jc w:val="center"/>
+              <w:rPr>
+                <w:rFonts w:ascii="Gordita Light" w:hAnsi="Gordita Light" w:cs="GorditaLight"/>
+                <w:sz w:val="18"/>
+                <w:szCs w:val="18"/>
+              </w:rPr>
+            </w:pPr>
+          </w:p>
+          <w:p>
+            <w:pPr>
+              <w:jc w:val="center"/>
+              <w:rPr>
+                <w:rFonts w:ascii="Gordita Light" w:hAnsi="Gordita Light" w:cs="GorditaLight"/>
+                <w:color w:val="4F83BE"/>
+              </w:rPr>
+            </w:pPr>
+            <w:r>
+              <w:rPr>
+                <w:rFonts w:ascii="Gordita Light" w:hAnsi="Gordita Light" w:cs="GorditaLight"/>
+                <w:sz w:val="18"/>
+                <w:szCs w:val="18"/>
+              </w:rPr>
+              <w:t>[IMAGE</w:t>
+            </w:r>
+            <w:r>
+              <w:rPr>
+                <w:rFonts w:ascii="Gordita Light" w:hAnsi="Gordita Light" w:cs="GorditaLight"/>
+                <w:sz w:val="18"/>
+                <w:szCs w:val="18"/>
+              </w:rPr>
+              <w:t>20</w:t>
+            </w:r>
+            <w:r>
+              <w:rPr>
+                <w:rFonts w:ascii="Gordita Light" w:hAnsi="Gordita Light" w:cs="GorditaLight"/>
+                <w:sz w:val="18"/>
+                <w:szCs w:val="18"/>
+              </w:rPr>
+              <w:t>]</w:t>
+            </w:r>
+          </w:p>
+          <w:p>
+            <w:pPr>
+              <w:rPr>
+                <w:rFonts w:ascii="Gordita Light" w:hAnsi="Gordita Light" w:cs="GorditaLight"/>
+                <w:color w:val="4F83BE"/>
+              </w:rPr>
+            </w:pPr>
+          </w:p>
+        </w:tc>
+      </w:tr>
+      <w:tr>
+        <w:trPr>
+          <w:trHeight w:val="5108"/>
+        </w:trPr>
+        <w:tc>
+          <w:tcPr>
+            <w:tcW w:w="4315" w:type="dxa"/>
+          </w:tcPr>
+          <w:p>
+            <w:pPr>
+              <w:jc w:val="center"/>
+              <w:rPr>
+                <w:rFonts w:ascii="Gordita Light" w:hAnsi="Gordita Light" w:cs="GorditaLight"/>
+                <w:sz w:val="18"/>
+                <w:szCs w:val="18"/>
+              </w:rPr>
+            </w:pPr>
+            <w:r>
+              <w:rPr>
+                <w:rFonts w:ascii="Gordita Light" w:hAnsi="Gordita Light" w:cs="GorditaLight"/>
+                <w:sz w:val="18"/>
+                <w:szCs w:val="18"/>
+              </w:rPr>
+              <w:t>[TITLE</w:t>
+            </w:r>
+            <w:r>
+              <w:rPr>
+                <w:rFonts w:ascii="Gordita Light" w:hAnsi="Gordita Light" w:cs="GorditaLight"/>
+                <w:sz w:val="18"/>
+                <w:szCs w:val="18"/>
+              </w:rPr>
+              <w:t>21</w:t>
+            </w:r>
+            <w:r>
+              <w:rPr>
+                <w:rFonts w:ascii="Gordita Light" w:hAnsi="Gordita Light" w:cs="GorditaLight"/>
+                <w:sz w:val="18"/>
+                <w:szCs w:val="18"/>
+              </w:rPr>
+              <w:t>]</w:t>
+            </w:r>
+          </w:p>
+          <w:p>
+            <w:pPr>
+              <w:jc w:val="center"/>
+              <w:rPr>
+                <w:rFonts w:ascii="Gordita Light" w:hAnsi="Gordita Light" w:cs="GorditaLight"/>
+                <w:sz w:val="18"/>
+                <w:szCs w:val="18"/>
+              </w:rPr>
+            </w:pPr>
+          </w:p>
+          <w:p>
+            <w:pPr>
+              <w:jc w:val="center"/>
+              <w:rPr>
+                <w:rFonts w:ascii="Gordita Light" w:hAnsi="Gordita Light" w:cs="GorditaLight"/>
+                <w:color w:val="4F83BE"/>
+              </w:rPr>
+            </w:pPr>
+            <w:r>
+              <w:rPr>
+                <w:rFonts w:ascii="Gordita Light" w:hAnsi="Gordita Light" w:cs="GorditaLight"/>
+                <w:sz w:val="18"/>
+                <w:szCs w:val="18"/>
+              </w:rPr>
+              <w:t>[IMAGE</w:t>
+            </w:r>
+            <w:r>
+              <w:rPr>
+                <w:rFonts w:ascii="Gordita Light" w:hAnsi="Gordita Light" w:cs="GorditaLight"/>
+                <w:sz w:val="18"/>
+                <w:szCs w:val="18"/>
+              </w:rPr>
+              <w:t>21</w:t>
+            </w:r>
+            <w:r>
+              <w:rPr>
+                <w:rFonts w:ascii="Gordita Light" w:hAnsi="Gordita Light" w:cs="GorditaLight"/>
+                <w:sz w:val="18"/>
+                <w:szCs w:val="18"/>
+              </w:rPr>
+              <w:t>]</w:t>
+            </w:r>
+          </w:p>
+          <w:p>
+            <w:pPr>
+              <w:rPr>
+                <w:rFonts w:ascii="Gordita Light" w:hAnsi="Gordita Light" w:cs="GorditaLight"/>
+                <w:color w:val="4F83BE"/>
+              </w:rPr>
+            </w:pPr>
+          </w:p>
+        </w:tc>
+        <w:tc>
+          <w:tcPr>
+            <w:tcW w:w="4315" w:type="dxa"/>
+          </w:tcPr>
+          <w:p>
+            <w:pPr>
+              <w:jc w:val="center"/>
+              <w:rPr>
+                <w:rFonts w:ascii="Gordita Light" w:hAnsi="Gordita Light" w:cs="GorditaLight"/>
+                <w:sz w:val="18"/>
+                <w:szCs w:val="18"/>
+              </w:rPr>
+            </w:pPr>
+            <w:r>
+              <w:rPr>
+                <w:rFonts w:ascii="Gordita Light" w:hAnsi="Gordita Light" w:cs="GorditaLight"/>
+                <w:sz w:val="18"/>
+                <w:szCs w:val="18"/>
+              </w:rPr>
+              <w:t>[TITLE</w:t>
+            </w:r>
+            <w:r>
+              <w:rPr>
+                <w:rFonts w:ascii="Gordita Light" w:hAnsi="Gordita Light" w:cs="GorditaLight"/>
+                <w:sz w:val="18"/>
+                <w:szCs w:val="18"/>
+              </w:rPr>
+              <w:t>22</w:t>
+            </w:r>
+            <w:r>
+              <w:rPr>
+                <w:rFonts w:ascii="Gordita Light" w:hAnsi="Gordita Light" w:cs="GorditaLight"/>
+                <w:sz w:val="18"/>
+                <w:szCs w:val="18"/>
+              </w:rPr>
+              <w:t>]</w:t>
+            </w:r>
+          </w:p>
+          <w:p>
+            <w:pPr>
+              <w:jc w:val="center"/>
+              <w:rPr>
+                <w:rFonts w:ascii="Gordita Light" w:hAnsi="Gordita Light" w:cs="GorditaLight"/>
+                <w:sz w:val="18"/>
+                <w:szCs w:val="18"/>
+              </w:rPr>
+            </w:pPr>
+          </w:p>
+          <w:p>
+            <w:pPr>
+              <w:jc w:val="center"/>
+              <w:rPr>
+                <w:rFonts w:ascii="Gordita Light" w:hAnsi="Gordita Light" w:cs="GorditaLight"/>
+                <w:color w:val="4F83BE"/>
+              </w:rPr>
+            </w:pPr>
+            <w:r>
+              <w:rPr>
+                <w:rFonts w:ascii="Gordita Light" w:hAnsi="Gordita Light" w:cs="GorditaLight"/>
+                <w:sz w:val="18"/>
+                <w:szCs w:val="18"/>
+              </w:rPr>
+              <w:t>[IMAGE</w:t>
+            </w:r>
+            <w:r>
+              <w:rPr>
+                <w:rFonts w:ascii="Gordita Light" w:hAnsi="Gordita Light" w:cs="GorditaLight"/>
+                <w:sz w:val="18"/>
+                <w:szCs w:val="18"/>
+              </w:rPr>
+              <w:t>22</w:t>
+            </w:r>
+            <w:r>
+              <w:rPr>
+                <w:rFonts w:ascii="Gordita Light" w:hAnsi="Gordita Light" w:cs="GorditaLight"/>
+                <w:sz w:val="18"/>
+                <w:szCs w:val="18"/>
+              </w:rPr>
+              <w:t>]</w:t>
+            </w:r>
+          </w:p>
+          <w:p>
+            <w:pPr>
+              <w:rPr>
+                <w:rFonts w:ascii="Gordita Light" w:hAnsi="Gordita Light" w:cs="GorditaLight"/>
+                <w:color w:val="4F83BE"/>
+              </w:rPr>
+            </w:pPr>
+          </w:p>
+        </w:tc>
+      </w:tr>
+    </w:tbl>
+    <w:p/>
     <w:sectPr>
       <w:headerReference w:type="even" r:id="rId8"/>
       <w:headerReference w:type="default" r:id="rId9"/>
@@ -13623,129 +13760,8 @@
                 </w14:gradFill>
               </w14:textFill>
             </w:rPr>
-            <w:t xml:space="preserve">Date </w:t>
+            <w:t>Date of issue</w:t>
           </w:r>
-          <w:proofErr w:type="spellStart"/>
-          <w:r>
-            <w:rPr>
-              <w:rFonts w:ascii="Gordita Light" w:hAnsi="Gordita Light" w:cs="GorditaLight"/>
-              <w:b/>
-              <w:bCs/>
-              <w:i/>
-              <w:iCs/>
-              <w:color w:val="4F83BE"/>
-              <w:sz w:val="18"/>
-              <w:szCs w:val="18"/>
-              <w:lang w:val="es-ES"/>
-              <w14:textFill>
-                <w14:gradFill>
-                  <w14:gsLst>
-                    <w14:gs w14:pos="0">
-                      <w14:srgbClr w14:val="4F83BE">
-                        <w14:tint w14:val="66000"/>
-                        <w14:satMod w14:val="160000"/>
-                      </w14:srgbClr>
-                    </w14:gs>
-                    <w14:gs w14:pos="50000">
-                      <w14:srgbClr w14:val="4F83BE">
-                        <w14:tint w14:val="44500"/>
-                        <w14:satMod w14:val="160000"/>
-                      </w14:srgbClr>
-                    </w14:gs>
-                    <w14:gs w14:pos="100000">
-                      <w14:srgbClr w14:val="4F83BE">
-                        <w14:tint w14:val="23500"/>
-                        <w14:satMod w14:val="160000"/>
-                      </w14:srgbClr>
-                    </w14:gs>
-                  </w14:gsLst>
-                  <w14:lin w14:ang="16200000" w14:scaled="0"/>
-                </w14:gradFill>
-              </w14:textFill>
-            </w:rPr>
-            <w:t>of</w:t>
-          </w:r>
-          <w:proofErr w:type="spellEnd"/>
-          <w:r>
-            <w:rPr>
-              <w:rFonts w:ascii="Gordita Light" w:hAnsi="Gordita Light" w:cs="GorditaLight"/>
-              <w:b/>
-              <w:bCs/>
-              <w:i/>
-              <w:iCs/>
-              <w:color w:val="4F83BE"/>
-              <w:sz w:val="18"/>
-              <w:szCs w:val="18"/>
-              <w:lang w:val="es-ES"/>
-              <w14:textFill>
-                <w14:gradFill>
-                  <w14:gsLst>
-                    <w14:gs w14:pos="0">
-                      <w14:srgbClr w14:val="4F83BE">
-                        <w14:tint w14:val="66000"/>
-                        <w14:satMod w14:val="160000"/>
-                      </w14:srgbClr>
-                    </w14:gs>
-                    <w14:gs w14:pos="50000">
-                      <w14:srgbClr w14:val="4F83BE">
-                        <w14:tint w14:val="44500"/>
-                        <w14:satMod w14:val="160000"/>
-                      </w14:srgbClr>
-                    </w14:gs>
-                    <w14:gs w14:pos="100000">
-                      <w14:srgbClr w14:val="4F83BE">
-                        <w14:tint w14:val="23500"/>
-                        <w14:satMod w14:val="160000"/>
-                      </w14:srgbClr>
-                    </w14:gs>
-                  </w14:gsLst>
-                  <w14:lin w14:ang="16200000" w14:scaled="0"/>
-                </w14:gradFill>
-              </w14:textFill>
-            </w:rPr>
-            <w:t xml:space="preserve"> </w:t>
-          </w:r>
-          <w:proofErr w:type="spellStart"/>
-          <w:r>
-            <w:rPr>
-              <w:rFonts w:ascii="Gordita Light" w:hAnsi="Gordita Light" w:cs="GorditaLight"/>
-              <w:b/>
-              <w:bCs/>
-              <w:i/>
-              <w:iCs/>
-              <w:color w:val="4F83BE"/>
-              <w:sz w:val="18"/>
-              <w:szCs w:val="18"/>
-              <w:lang w:val="es-ES"/>
-              <w14:textFill>
-                <w14:gradFill>
-                  <w14:gsLst>
-                    <w14:gs w14:pos="0">
-                      <w14:srgbClr w14:val="4F83BE">
-                        <w14:tint w14:val="66000"/>
-                        <w14:satMod w14:val="160000"/>
-                      </w14:srgbClr>
-                    </w14:gs>
-                    <w14:gs w14:pos="50000">
-                      <w14:srgbClr w14:val="4F83BE">
-                        <w14:tint w14:val="44500"/>
-                        <w14:satMod w14:val="160000"/>
-                      </w14:srgbClr>
-                    </w14:gs>
-                    <w14:gs w14:pos="100000">
-                      <w14:srgbClr w14:val="4F83BE">
-                        <w14:tint w14:val="23500"/>
-                        <w14:satMod w14:val="160000"/>
-                      </w14:srgbClr>
-                    </w14:gs>
-                  </w14:gsLst>
-                  <w14:lin w14:ang="16200000" w14:scaled="0"/>
-                </w14:gradFill>
-              </w14:textFill>
-            </w:rPr>
-            <w:t>issue</w:t>
-          </w:r>
-          <w:proofErr w:type="spellEnd"/>
         </w:p>
       </w:tc>
       <w:tc>
@@ -14286,129 +14302,8 @@
                 </w14:gradFill>
               </w14:textFill>
             </w:rPr>
-            <w:t xml:space="preserve">Date </w:t>
+            <w:t>Date of issue</w:t>
           </w:r>
-          <w:proofErr w:type="spellStart"/>
-          <w:r>
-            <w:rPr>
-              <w:rFonts w:ascii="Gordita Light" w:hAnsi="Gordita Light" w:cs="GorditaLight"/>
-              <w:b/>
-              <w:bCs/>
-              <w:i/>
-              <w:iCs/>
-              <w:color w:val="4F83BE"/>
-              <w:sz w:val="18"/>
-              <w:szCs w:val="18"/>
-              <w:lang w:val="es-ES"/>
-              <w14:textFill>
-                <w14:gradFill>
-                  <w14:gsLst>
-                    <w14:gs w14:pos="0">
-                      <w14:srgbClr w14:val="4F83BE">
-                        <w14:tint w14:val="66000"/>
-                        <w14:satMod w14:val="160000"/>
-                      </w14:srgbClr>
-                    </w14:gs>
-                    <w14:gs w14:pos="50000">
-                      <w14:srgbClr w14:val="4F83BE">
-                        <w14:tint w14:val="44500"/>
-                        <w14:satMod w14:val="160000"/>
-                      </w14:srgbClr>
-                    </w14:gs>
-                    <w14:gs w14:pos="100000">
-                      <w14:srgbClr w14:val="4F83BE">
-                        <w14:tint w14:val="23500"/>
-                        <w14:satMod w14:val="160000"/>
-                      </w14:srgbClr>
-                    </w14:gs>
-                  </w14:gsLst>
-                  <w14:lin w14:ang="16200000" w14:scaled="0"/>
-                </w14:gradFill>
-              </w14:textFill>
-            </w:rPr>
-            <w:t>of</w:t>
-          </w:r>
-          <w:proofErr w:type="spellEnd"/>
-          <w:r>
-            <w:rPr>
-              <w:rFonts w:ascii="Gordita Light" w:hAnsi="Gordita Light" w:cs="GorditaLight"/>
-              <w:b/>
-              <w:bCs/>
-              <w:i/>
-              <w:iCs/>
-              <w:color w:val="4F83BE"/>
-              <w:sz w:val="18"/>
-              <w:szCs w:val="18"/>
-              <w:lang w:val="es-ES"/>
-              <w14:textFill>
-                <w14:gradFill>
-                  <w14:gsLst>
-                    <w14:gs w14:pos="0">
-                      <w14:srgbClr w14:val="4F83BE">
-                        <w14:tint w14:val="66000"/>
-                        <w14:satMod w14:val="160000"/>
-                      </w14:srgbClr>
-                    </w14:gs>
-                    <w14:gs w14:pos="50000">
-                      <w14:srgbClr w14:val="4F83BE">
-                        <w14:tint w14:val="44500"/>
-                        <w14:satMod w14:val="160000"/>
-                      </w14:srgbClr>
-                    </w14:gs>
-                    <w14:gs w14:pos="100000">
-                      <w14:srgbClr w14:val="4F83BE">
-                        <w14:tint w14:val="23500"/>
-                        <w14:satMod w14:val="160000"/>
-                      </w14:srgbClr>
-                    </w14:gs>
-                  </w14:gsLst>
-                  <w14:lin w14:ang="16200000" w14:scaled="0"/>
-                </w14:gradFill>
-              </w14:textFill>
-            </w:rPr>
-            <w:t xml:space="preserve"> </w:t>
-          </w:r>
-          <w:proofErr w:type="spellStart"/>
-          <w:r>
-            <w:rPr>
-              <w:rFonts w:ascii="Gordita Light" w:hAnsi="Gordita Light" w:cs="GorditaLight"/>
-              <w:b/>
-              <w:bCs/>
-              <w:i/>
-              <w:iCs/>
-              <w:color w:val="4F83BE"/>
-              <w:sz w:val="18"/>
-              <w:szCs w:val="18"/>
-              <w:lang w:val="es-ES"/>
-              <w14:textFill>
-                <w14:gradFill>
-                  <w14:gsLst>
-                    <w14:gs w14:pos="0">
-                      <w14:srgbClr w14:val="4F83BE">
-                        <w14:tint w14:val="66000"/>
-                        <w14:satMod w14:val="160000"/>
-                      </w14:srgbClr>
-                    </w14:gs>
-                    <w14:gs w14:pos="50000">
-                      <w14:srgbClr w14:val="4F83BE">
-                        <w14:tint w14:val="44500"/>
-                        <w14:satMod w14:val="160000"/>
-                      </w14:srgbClr>
-                    </w14:gs>
-                    <w14:gs w14:pos="100000">
-                      <w14:srgbClr w14:val="4F83BE">
-                        <w14:tint w14:val="23500"/>
-                        <w14:satMod w14:val="160000"/>
-                      </w14:srgbClr>
-                    </w14:gs>
-                  </w14:gsLst>
-                  <w14:lin w14:ang="16200000" w14:scaled="0"/>
-                </w14:gradFill>
-              </w14:textFill>
-            </w:rPr>
-            <w:t>issue</w:t>
-          </w:r>
-          <w:proofErr w:type="spellEnd"/>
         </w:p>
       </w:tc>
       <w:tc>

</xml_diff>